<commit_message>
Point references to the Change Management and Configuration Governance Plan
The team's Change Management and Configuration Governance Plan replaces
our generated Change Management Plan. References now cite its sections:

- Checklist rows 1.4.1.2, 1.5.2.6, 2.4.1.3, 2.4.1.5, 2.4.1.8, 2.4.1.11
  and 5.3.1 point to the matching sections of the new plan; 2.3.1.1 b)
  keeps only its Project Plan reference.
- Row 1.6.11.2 drops the ITIL 4 and ISO/IEC 20000-1 claim, which only
  the replaced plan supported.
- The checklist introduction and the security plan's scope use the new
  plan's name.
- The checklist no longer resolves references into the replaced plan.

Co-Authored-By: Claude Opus 5.5 <noreply@anthropic.com>
Claude-Session: https://claude.ai/code/session_01G5KtDfxnVyqdZUVCaXFbWe
</commit_message>
<xml_diff>
--- a/Technical-Responsiveness-Checklist.docx
+++ b/Technical-Responsiveness-Checklist.docx
@@ -186,7 +186,7 @@
               </w:rPr>
               <w:t xml:space="default">2. Service Specifications, Supply and Install Items</w:t>
               <w:tab/>
-              <w:t xml:space="default">20</w:t>
+              <w:t xml:space="default">19</w:t>
             </w:r>
           </w:hyperlink>
         </w:p>
@@ -205,7 +205,7 @@
               </w:rPr>
               <w:t xml:space="default">2.1 System integration</w:t>
               <w:tab/>
-              <w:t xml:space="default">20</w:t>
+              <w:t xml:space="default">19</w:t>
             </w:r>
           </w:hyperlink>
         </w:p>
@@ -224,7 +224,7 @@
               </w:rPr>
               <w:t xml:space="default">2.2 Training and training materials</w:t>
               <w:tab/>
-              <w:t xml:space="default">24</w:t>
+              <w:t xml:space="default">23</w:t>
             </w:r>
           </w:hyperlink>
         </w:p>
@@ -243,7 +243,7 @@
               </w:rPr>
               <w:t xml:space="default">2.3 Documentation requirements</w:t>
               <w:tab/>
-              <w:t xml:space="default">27</w:t>
+              <w:t xml:space="default">26</w:t>
             </w:r>
           </w:hyperlink>
         </w:p>
@@ -262,7 +262,7 @@
               </w:rPr>
               <w:t xml:space="default">2.4 Requirements of the Supplier's technical team</w:t>
               <w:tab/>
-              <w:t xml:space="default">30</w:t>
+              <w:t xml:space="default">29</w:t>
             </w:r>
           </w:hyperlink>
         </w:p>
@@ -582,7 +582,7 @@
           <w:i w:val="false"/>
           <w:iCs w:val="false"/>
         </w:rPr>
-        <w:t xml:space="preserve"> This is the item-by-item commentary on the Technical Requirements required by ITP 16.2(c), in the Technical Responsiveness Checklist format of Section IV. Its sections follow the numbering of Section VII. For each requirement it gives the Section VII clause and a short description, the technical reasons supporting compliance, and cross-references to the supporting information in the System Architecture, the Preliminary Project Plan, the Cybersecurity Risk Management Plan, the Change Management Plan and the attachments.</w:t>
+        <w:t xml:space="preserve"> This is the item-by-item commentary on the Technical Requirements required by ITP 16.2(c), in the Technical Responsiveness Checklist format of Section IV. Its sections follow the numbering of Section VII. For each requirement it gives the Section VII clause and a short description, the technical reasons supporting compliance, and cross-references to the supporting information in the System Architecture, the Preliminary Project Plan, the Cybersecurity Risk Management Plan, the Change Management and Configuration Governance Plan and the attachments.</w:t>
       </w:r>
     </w:p>
     <w:p>
@@ -7993,50 +7993,26 @@
                 <w:i w:val="false"/>
                 <w:iCs w:val="false"/>
               </w:rPr>
-              <w:t xml:space="preserve">; </w:t>
-            </w:r>
-            <w:r>
-              <w:rPr>
-                <w:b w:val="false"/>
-                <w:bCs w:val="false"/>
-                <w:i w:val="false"/>
-                <w:iCs w:val="false"/>
-              </w:rPr>
-              <w:t xml:space="preserve">Change Management Plan Sections </w:t>
-            </w:r>
-            <w:fldSimple w:instr="HYPERLINK &quot;Change-Management-Plan.docx&quot; \l &quot;sec_5_1&quot;">
-              <w:r>
-                <w:rPr>
-                  <w:rStyle w:val="Hyperlink"/>
-                  <w:b w:val="false"/>
-                  <w:bCs w:val="false"/>
-                  <w:i w:val="false"/>
-                  <w:iCs w:val="false"/>
-                </w:rPr>
-                <w:t xml:space="preserve">5.1</w:t>
-              </w:r>
-            </w:fldSimple>
-            <w:r>
-              <w:rPr>
-                <w:b w:val="false"/>
-                <w:bCs w:val="false"/>
-                <w:i w:val="false"/>
-                <w:iCs w:val="false"/>
-              </w:rPr>
-              <w:t xml:space="preserve"> and </w:t>
-            </w:r>
-            <w:fldSimple w:instr="HYPERLINK &quot;Change-Management-Plan.docx&quot; \l &quot;sec_5_2&quot;">
-              <w:r>
-                <w:rPr>
-                  <w:rStyle w:val="Hyperlink"/>
-                  <w:b w:val="false"/>
-                  <w:bCs w:val="false"/>
-                  <w:i w:val="false"/>
-                  <w:iCs w:val="false"/>
-                </w:rPr>
-                <w:t xml:space="preserve">5.2</w:t>
-              </w:r>
-            </w:fldSimple>
+              <w:t xml:space="preserve">; Change Management and Configuration Governance Plan </w:t>
+            </w:r>
+            <w:r>
+              <w:rPr>
+                <w:b w:val="false"/>
+                <w:bCs w:val="false"/>
+                <w:i w:val="false"/>
+                <w:iCs w:val="false"/>
+              </w:rPr>
+              <w:t xml:space="preserve">Sections 4</w:t>
+            </w:r>
+            <w:r>
+              <w:rPr>
+                <w:b w:val="false"/>
+                <w:bCs w:val="false"/>
+                <w:i w:val="false"/>
+                <w:iCs w:val="false"/>
+              </w:rPr>
+              <w:t xml:space="preserve"> to 14</w:t>
+            </w:r>
           </w:p>
         </w:tc>
       </w:tr>
@@ -11818,29 +11794,17 @@
                 <w:i w:val="false"/>
                 <w:iCs w:val="false"/>
               </w:rPr>
-              <w:t xml:space="preserve">; </w:t>
-            </w:r>
-            <w:r>
-              <w:rPr>
-                <w:b w:val="false"/>
-                <w:bCs w:val="false"/>
-                <w:i w:val="false"/>
-                <w:iCs w:val="false"/>
-              </w:rPr>
-              <w:t xml:space="preserve">Change Management Plan Section </w:t>
-            </w:r>
-            <w:fldSimple w:instr="HYPERLINK &quot;Change-Management-Plan.docx&quot; \l &quot;sec_5_2&quot;">
-              <w:r>
-                <w:rPr>
-                  <w:rStyle w:val="Hyperlink"/>
-                  <w:b w:val="false"/>
-                  <w:bCs w:val="false"/>
-                  <w:i w:val="false"/>
-                  <w:iCs w:val="false"/>
-                </w:rPr>
-                <w:t xml:space="preserve">5.2</w:t>
-              </w:r>
-            </w:fldSimple>
+              <w:t xml:space="preserve">; Change Management and Configuration Governance Plan </w:t>
+            </w:r>
+            <w:r>
+              <w:rPr>
+                <w:b w:val="false"/>
+                <w:bCs w:val="false"/>
+                <w:i w:val="false"/>
+                <w:iCs w:val="false"/>
+              </w:rPr>
+              <w:t xml:space="preserve">Section 9</w:t>
+            </w:r>
           </w:p>
         </w:tc>
       </w:tr>
@@ -14246,7 +14210,7 @@
                 <w:i w:val="false"/>
                 <w:iCs w:val="false"/>
               </w:rPr>
-              <w:t xml:space="preserve">Complies. Inkript's information security management system is certified to ISO/IEC 27001, the mandatory certification, maintained throughout the Contract, with the certificate copy attached. The card manufacturer's ISO 9001 certificate is attached, and technical change control is structured on ITIL 4 change enablement and ISO/IEC 20000-1 change management. [GAP: No document states whether Inkript holds ISO 9001 or ISO/IEC 20000-1 (</w:t>
+              <w:t xml:space="preserve">Complies. Inkript's information security management system is certified to ISO/IEC 27001, the mandatory certification, maintained throughout the Contract, with the certificate copy attached. The card manufacturer's ISO 9001 certificate is attached. [GAP: No document states whether Inkript holds ISO 9001 or ISO/IEC 20000-1 (</w:t>
             </w:r>
             <w:r>
               <w:rPr>
@@ -14355,36 +14319,6 @@
                   <w:iCs w:val="false"/>
                 </w:rPr>
                 <w:t xml:space="preserve">11.3</w:t>
-              </w:r>
-            </w:fldSimple>
-            <w:r>
-              <w:rPr>
-                <w:b w:val="false"/>
-                <w:bCs w:val="false"/>
-                <w:i w:val="false"/>
-                <w:iCs w:val="false"/>
-              </w:rPr>
-              <w:t xml:space="preserve">; </w:t>
-            </w:r>
-            <w:r>
-              <w:rPr>
-                <w:b w:val="false"/>
-                <w:bCs w:val="false"/>
-                <w:i w:val="false"/>
-                <w:iCs w:val="false"/>
-              </w:rPr>
-              <w:t xml:space="preserve">Change Management Plan Section </w:t>
-            </w:r>
-            <w:fldSimple w:instr="HYPERLINK &quot;Change-Management-Plan.docx&quot; \l &quot;sec_1_2&quot;">
-              <w:r>
-                <w:rPr>
-                  <w:rStyle w:val="Hyperlink"/>
-                  <w:b w:val="false"/>
-                  <w:bCs w:val="false"/>
-                  <w:i w:val="false"/>
-                  <w:iCs w:val="false"/>
-                </w:rPr>
-                <w:t xml:space="preserve">1.2</w:t>
               </w:r>
             </w:fldSimple>
             <w:r>
@@ -21211,36 +21145,6 @@
                 <w:t xml:space="preserve">2.10</w:t>
               </w:r>
             </w:fldSimple>
-            <w:r>
-              <w:rPr>
-                <w:b w:val="false"/>
-                <w:bCs w:val="false"/>
-                <w:i w:val="false"/>
-                <w:iCs w:val="false"/>
-              </w:rPr>
-              <w:t xml:space="preserve">; </w:t>
-            </w:r>
-            <w:r>
-              <w:rPr>
-                <w:b w:val="false"/>
-                <w:bCs w:val="false"/>
-                <w:i w:val="false"/>
-                <w:iCs w:val="false"/>
-              </w:rPr>
-              <w:t xml:space="preserve">Change Management Plan Section </w:t>
-            </w:r>
-            <w:fldSimple w:instr="HYPERLINK &quot;Change-Management-Plan.docx&quot; \l &quot;sec_6_2&quot;">
-              <w:r>
-                <w:rPr>
-                  <w:rStyle w:val="Hyperlink"/>
-                  <w:b w:val="false"/>
-                  <w:bCs w:val="false"/>
-                  <w:i w:val="false"/>
-                  <w:iCs w:val="false"/>
-                </w:rPr>
-                <w:t xml:space="preserve">6.2</w:t>
-              </w:r>
-            </w:fldSimple>
           </w:p>
         </w:tc>
       </w:tr>
@@ -23966,7 +23870,7 @@
                 <w:i w:val="false"/>
                 <w:iCs w:val="false"/>
               </w:rPr>
-              <w:t xml:space="preserve">Complies. The Solution Architect leads security architecture and design, assesses the impact of technical changes and sits on the change board as Supplier technical lead. The nominee holds a Bachelor's degree in a listed field, at least five years in solution architecture, systems integration, interoperability and technical assurance, and TOGAF and solutions architecture certification. [CONFIRM: </w:t>
+              <w:t xml:space="preserve">Complies. The Solution Architect leads security architecture and design, assesses the impact of technical changes and approves medium and high-risk changes as technical lead. The nominee holds a Bachelor's degree in a listed field, at least five years in solution architecture, systems integration, interoperability and technical assurance, and TOGAF and solutions architecture certification. [CONFIRM: </w:t>
             </w:r>
             <w:r>
               <w:rPr>
@@ -24042,50 +23946,17 @@
                 <w:i w:val="false"/>
                 <w:iCs w:val="false"/>
               </w:rPr>
-              <w:t xml:space="preserve">; </w:t>
-            </w:r>
-            <w:r>
-              <w:rPr>
-                <w:b w:val="false"/>
-                <w:bCs w:val="false"/>
-                <w:i w:val="false"/>
-                <w:iCs w:val="false"/>
-              </w:rPr>
-              <w:t xml:space="preserve">Change Management Plan Sections </w:t>
-            </w:r>
-            <w:fldSimple w:instr="HYPERLINK &quot;Change-Management-Plan.docx&quot; \l &quot;sec_3_1&quot;">
-              <w:r>
-                <w:rPr>
-                  <w:rStyle w:val="Hyperlink"/>
-                  <w:b w:val="false"/>
-                  <w:bCs w:val="false"/>
-                  <w:i w:val="false"/>
-                  <w:iCs w:val="false"/>
-                </w:rPr>
-                <w:t xml:space="preserve">3.1</w:t>
-              </w:r>
-            </w:fldSimple>
-            <w:r>
-              <w:rPr>
-                <w:b w:val="false"/>
-                <w:bCs w:val="false"/>
-                <w:i w:val="false"/>
-                <w:iCs w:val="false"/>
-              </w:rPr>
-              <w:t xml:space="preserve"> and </w:t>
-            </w:r>
-            <w:fldSimple w:instr="HYPERLINK &quot;Change-Management-Plan.docx&quot; \l &quot;sec_6_1&quot;">
-              <w:r>
-                <w:rPr>
-                  <w:rStyle w:val="Hyperlink"/>
-                  <w:b w:val="false"/>
-                  <w:bCs w:val="false"/>
-                  <w:i w:val="false"/>
-                  <w:iCs w:val="false"/>
-                </w:rPr>
-                <w:t xml:space="preserve">6.1</w:t>
-              </w:r>
-            </w:fldSimple>
+              <w:t xml:space="preserve">; Change Management and Configuration Governance Plan </w:t>
+            </w:r>
+            <w:r>
+              <w:rPr>
+                <w:b w:val="false"/>
+                <w:bCs w:val="false"/>
+                <w:i w:val="false"/>
+                <w:iCs w:val="false"/>
+              </w:rPr>
+              <w:t xml:space="preserve">Sections 4 and 8</w:t>
+            </w:r>
             <w:r>
               <w:rPr>
                 <w:b w:val="false"/>
@@ -24397,29 +24268,17 @@
                 <w:i w:val="false"/>
                 <w:iCs w:val="false"/>
               </w:rPr>
-              <w:t xml:space="preserve">; </w:t>
-            </w:r>
-            <w:r>
-              <w:rPr>
-                <w:b w:val="false"/>
-                <w:bCs w:val="false"/>
-                <w:i w:val="false"/>
-                <w:iCs w:val="false"/>
-              </w:rPr>
-              <w:t xml:space="preserve">Change Management Plan Section </w:t>
-            </w:r>
-            <w:fldSimple w:instr="HYPERLINK &quot;Change-Management-Plan.docx&quot; \l &quot;sec_6_1&quot;">
-              <w:r>
-                <w:rPr>
-                  <w:rStyle w:val="Hyperlink"/>
-                  <w:b w:val="false"/>
-                  <w:bCs w:val="false"/>
-                  <w:i w:val="false"/>
-                  <w:iCs w:val="false"/>
-                </w:rPr>
-                <w:t xml:space="preserve">6.1</w:t>
-              </w:r>
-            </w:fldSimple>
+              <w:t xml:space="preserve">; Change Management and Configuration Governance Plan </w:t>
+            </w:r>
+            <w:r>
+              <w:rPr>
+                <w:b w:val="false"/>
+                <w:bCs w:val="false"/>
+                <w:i w:val="false"/>
+                <w:iCs w:val="false"/>
+              </w:rPr>
+              <w:t xml:space="preserve">Sections 2 and 4</w:t>
+            </w:r>
             <w:r>
               <w:rPr>
                 <w:b w:val="false"/>
@@ -24949,29 +24808,17 @@
                 <w:i w:val="false"/>
                 <w:iCs w:val="false"/>
               </w:rPr>
-              <w:t xml:space="preserve">; </w:t>
-            </w:r>
-            <w:r>
-              <w:rPr>
-                <w:b w:val="false"/>
-                <w:bCs w:val="false"/>
-                <w:i w:val="false"/>
-                <w:iCs w:val="false"/>
-              </w:rPr>
-              <w:t xml:space="preserve">Change Management Plan Section </w:t>
-            </w:r>
-            <w:fldSimple w:instr="HYPERLINK &quot;Change-Management-Plan.docx&quot; \l &quot;sec_6_1&quot;">
-              <w:r>
-                <w:rPr>
-                  <w:rStyle w:val="Hyperlink"/>
-                  <w:b w:val="false"/>
-                  <w:bCs w:val="false"/>
-                  <w:i w:val="false"/>
-                  <w:iCs w:val="false"/>
-                </w:rPr>
-                <w:t xml:space="preserve">6.1</w:t>
-              </w:r>
-            </w:fldSimple>
+              <w:t xml:space="preserve">; Change Management and Configuration Governance Plan </w:t>
+            </w:r>
+            <w:r>
+              <w:rPr>
+                <w:b w:val="false"/>
+                <w:bCs w:val="false"/>
+                <w:i w:val="false"/>
+                <w:iCs w:val="false"/>
+              </w:rPr>
+              <w:t xml:space="preserve">Section 10</w:t>
+            </w:r>
             <w:r>
               <w:rPr>
                 <w:b w:val="false"/>
@@ -25335,7 +25182,7 @@
                 <w:i w:val="false"/>
                 <w:iCs w:val="false"/>
               </w:rPr>
-              <w:t xml:space="preserve">Complies. The Training and Change Management Specialist holds a degree in ICT, education or human resource development, trainer and change management certifications, Prosci preferred, and at least five years delivering ICT training to government staff, operators and administrators, and leads the training program and change management from week 1 to week 32. [CONFIRM: Confirm the trainer and change management certificates, Prosci where held, are attached with the Key Personnel forms.]</w:t>
+              <w:t xml:space="preserve">Complies. The Training and Change Management Specialist holds a degree in ICT, education or human resource development, trainer and change management certifications, Prosci preferred, and at least five years delivering ICT training to government staff, operators and administrators, and leads the training program, including the training needs that changes to the system create. [CONFIRM: Confirm the trainer and change management certificates, Prosci where held, are attached with the Key Personnel forms.]</w:t>
             </w:r>
           </w:p>
         </w:tc>
@@ -25360,36 +25207,6 @@
                 <w:i w:val="false"/>
                 <w:iCs w:val="false"/>
               </w:rPr>
-              <w:t xml:space="preserve">Change Management Plan Section </w:t>
-            </w:r>
-            <w:fldSimple w:instr="HYPERLINK &quot;Change-Management-Plan.docx&quot; \l &quot;sec_6_1&quot;">
-              <w:r>
-                <w:rPr>
-                  <w:rStyle w:val="Hyperlink"/>
-                  <w:b w:val="false"/>
-                  <w:bCs w:val="false"/>
-                  <w:i w:val="false"/>
-                  <w:iCs w:val="false"/>
-                </w:rPr>
-                <w:t xml:space="preserve">6.1</w:t>
-              </w:r>
-            </w:fldSimple>
-            <w:r>
-              <w:rPr>
-                <w:b w:val="false"/>
-                <w:bCs w:val="false"/>
-                <w:i w:val="false"/>
-                <w:iCs w:val="false"/>
-              </w:rPr>
-              <w:t xml:space="preserve">; </w:t>
-            </w:r>
-            <w:r>
-              <w:rPr>
-                <w:b w:val="false"/>
-                <w:bCs w:val="false"/>
-                <w:i w:val="false"/>
-                <w:iCs w:val="false"/>
-              </w:rPr>
               <w:t xml:space="preserve">Preliminary Project Plan Section </w:t>
             </w:r>
             <w:fldSimple w:instr="HYPERLINK &quot;Preliminary-Project-Plan-Information-System-Sub-Plans.docx&quot; \l &quot;sec_3_8&quot;">
@@ -25404,6 +25221,24 @@
                 <w:t xml:space="preserve">3.8</w:t>
               </w:r>
             </w:fldSimple>
+            <w:r>
+              <w:rPr>
+                <w:b w:val="false"/>
+                <w:bCs w:val="false"/>
+                <w:i w:val="false"/>
+                <w:iCs w:val="false"/>
+              </w:rPr>
+              <w:t xml:space="preserve">; Change Management and Configuration Governance Plan </w:t>
+            </w:r>
+            <w:r>
+              <w:rPr>
+                <w:b w:val="false"/>
+                <w:bCs w:val="false"/>
+                <w:i w:val="false"/>
+                <w:iCs w:val="false"/>
+              </w:rPr>
+              <w:t xml:space="preserve">Section 16</w:t>
+            </w:r>
             <w:r>
               <w:rPr>
                 <w:b w:val="false"/>
@@ -44530,29 +44365,17 @@
                 <w:i w:val="false"/>
                 <w:iCs w:val="false"/>
               </w:rPr>
-              <w:t xml:space="preserve">; </w:t>
-            </w:r>
-            <w:r>
-              <w:rPr>
-                <w:b w:val="false"/>
-                <w:bCs w:val="false"/>
-                <w:i w:val="false"/>
-                <w:iCs w:val="false"/>
-              </w:rPr>
-              <w:t xml:space="preserve">Change Management Plan Section </w:t>
-            </w:r>
-            <w:fldSimple w:instr="HYPERLINK &quot;Change-Management-Plan.docx&quot; \l &quot;sec_5_3&quot;">
-              <w:r>
-                <w:rPr>
-                  <w:rStyle w:val="Hyperlink"/>
-                  <w:b w:val="false"/>
-                  <w:bCs w:val="false"/>
-                  <w:i w:val="false"/>
-                  <w:iCs w:val="false"/>
-                </w:rPr>
-                <w:t xml:space="preserve">5.3</w:t>
-              </w:r>
-            </w:fldSimple>
+              <w:t xml:space="preserve">; Change Management and Configuration Governance Plan </w:t>
+            </w:r>
+            <w:r>
+              <w:rPr>
+                <w:b w:val="false"/>
+                <w:bCs w:val="false"/>
+                <w:i w:val="false"/>
+                <w:iCs w:val="false"/>
+              </w:rPr>
+              <w:t xml:space="preserve">Sections 2 and 6</w:t>
+            </w:r>
           </w:p>
         </w:tc>
       </w:tr>

</xml_diff>

<commit_message>
Fill the facility works rows from RME's responses
RME confirmed the seven facility rows already answered and returned the
23 empty ones. Their answers name the generator, the access control,
intrusion and CCTV systems, the server room door and the drawings and
bill of quantities they will attach, so each row now carries those
specifics on top of the earlier draft, and cites the two attachments.

Co-Authored-By: Claude Opus 5.5 <noreply@anthropic.com>
Claude-Session: https://claude.ai/code/session_01G5KtDfxnVyqdZUVCaXFbWe
</commit_message>
<xml_diff>
--- a/Technical-Responsiveness-Checklist.docx
+++ b/Technical-Responsiveness-Checklist.docx
@@ -186,7 +186,7 @@
               </w:rPr>
               <w:t xml:space="default">2. Service Specifications, Supply and Install Items</w:t>
               <w:tab/>
-              <w:t xml:space="default">16</w:t>
+              <w:t xml:space="default">17</w:t>
             </w:r>
           </w:hyperlink>
         </w:p>
@@ -205,7 +205,7 @@
               </w:rPr>
               <w:t xml:space="default">2.1 System integration</w:t>
               <w:tab/>
-              <w:t xml:space="default">16</w:t>
+              <w:t xml:space="default">17</w:t>
             </w:r>
           </w:hyperlink>
         </w:p>
@@ -224,7 +224,7 @@
               </w:rPr>
               <w:t xml:space="default">2.2 Training and training materials</w:t>
               <w:tab/>
-              <w:t xml:space="default">20</w:t>
+              <w:t xml:space="default">21</w:t>
             </w:r>
           </w:hyperlink>
         </w:p>
@@ -243,7 +243,7 @@
               </w:rPr>
               <w:t xml:space="default">2.3 Documentation requirements</w:t>
               <w:tab/>
-              <w:t xml:space="default">22</w:t>
+              <w:t xml:space="default">23</w:t>
             </w:r>
           </w:hyperlink>
         </w:p>
@@ -262,7 +262,7 @@
               </w:rPr>
               <w:t xml:space="default">2.4 Requirements of the Supplier's technical team</w:t>
               <w:tab/>
-              <w:t xml:space="default">25</w:t>
+              <w:t xml:space="default">26</w:t>
             </w:r>
           </w:hyperlink>
         </w:p>
@@ -281,7 +281,7 @@
               </w:rPr>
               <w:t xml:space="default">3. Technology Specifications, Supply and Install Items</w:t>
               <w:tab/>
-              <w:t xml:space="default">29</w:t>
+              <w:t xml:space="default">30</w:t>
             </w:r>
           </w:hyperlink>
         </w:p>
@@ -300,7 +300,7 @@
               </w:rPr>
               <w:t xml:space="default">3.1 Automatic modular laser personalization systems</w:t>
               <w:tab/>
-              <w:t xml:space="default">29</w:t>
+              <w:t xml:space="default">30</w:t>
             </w:r>
           </w:hyperlink>
         </w:p>
@@ -319,7 +319,7 @@
               </w:rPr>
               <w:t xml:space="default">3.2 Personalization laser features</w:t>
               <w:tab/>
-              <w:t xml:space="default">31</w:t>
+              <w:t xml:space="default">32</w:t>
             </w:r>
           </w:hyperlink>
         </w:p>
@@ -338,7 +338,7 @@
               </w:rPr>
               <w:t xml:space="default">3.3 Automated mailing and dispatch systems</w:t>
               <w:tab/>
-              <w:t xml:space="default">33</w:t>
+              <w:t xml:space="default">34</w:t>
             </w:r>
           </w:hyperlink>
         </w:p>
@@ -357,7 +357,7 @@
               </w:rPr>
               <w:t xml:space="default">3.4 Polycarbonate cards</w:t>
               <w:tab/>
-              <w:t xml:space="default">35</w:t>
+              <w:t xml:space="default">36</w:t>
             </w:r>
           </w:hyperlink>
         </w:p>
@@ -376,7 +376,7 @@
               </w:rPr>
               <w:t xml:space="default">3.5 Renovation of premises</w:t>
               <w:tab/>
-              <w:t xml:space="default">36</w:t>
+              <w:t xml:space="default">37</w:t>
             </w:r>
           </w:hyperlink>
         </w:p>
@@ -395,7 +395,7 @@
               </w:rPr>
               <w:t xml:space="default">4. Testing and Quality Assurance Requirements</w:t>
               <w:tab/>
-              <w:t xml:space="default">39</w:t>
+              <w:t xml:space="default">41</w:t>
             </w:r>
           </w:hyperlink>
         </w:p>
@@ -414,7 +414,7 @@
               </w:rPr>
               <w:t xml:space="default">4.1 Inspections</w:t>
               <w:tab/>
-              <w:t xml:space="default">39</w:t>
+              <w:t xml:space="default">41</w:t>
             </w:r>
           </w:hyperlink>
         </w:p>
@@ -433,7 +433,7 @@
               </w:rPr>
               <w:t xml:space="default">4.2 Pre-commissioning tests</w:t>
               <w:tab/>
-              <w:t xml:space="default">39</w:t>
+              <w:t xml:space="default">41</w:t>
             </w:r>
           </w:hyperlink>
         </w:p>
@@ -452,7 +452,7 @@
               </w:rPr>
               <w:t xml:space="default">4.3 Operational acceptance tests</w:t>
               <w:tab/>
-              <w:t xml:space="default">42</w:t>
+              <w:t xml:space="default">44</w:t>
             </w:r>
           </w:hyperlink>
         </w:p>
@@ -471,7 +471,7 @@
               </w:rPr>
               <w:t xml:space="default">5. Service Specifications, Recurrent Cost Items</w:t>
               <w:tab/>
-              <w:t xml:space="default">46</w:t>
+              <w:t xml:space="default">48</w:t>
             </w:r>
           </w:hyperlink>
         </w:p>
@@ -490,7 +490,7 @@
               </w:rPr>
               <w:t xml:space="default">5.1 Warranty defect repair</w:t>
               <w:tab/>
-              <w:t xml:space="default">46</w:t>
+              <w:t xml:space="default">48</w:t>
             </w:r>
           </w:hyperlink>
         </w:p>
@@ -509,7 +509,7 @@
               </w:rPr>
               <w:t xml:space="default">5.2 Technical support</w:t>
               <w:tab/>
-              <w:t xml:space="default">46</w:t>
+              <w:t xml:space="default">48</w:t>
             </w:r>
           </w:hyperlink>
         </w:p>
@@ -528,7 +528,7 @@
               </w:rPr>
               <w:t xml:space="default">5.3 Requirements of the Supplier's technical team</w:t>
               <w:tab/>
-              <w:t xml:space="default">46</w:t>
+              <w:t xml:space="default">48</w:t>
             </w:r>
           </w:hyperlink>
           <w:r>
@@ -2130,7 +2130,7 @@
                 <w:i w:val="false"/>
                 <w:iCs w:val="false"/>
               </w:rPr>
-              <w:t xml:space="preserve"/>
+              <w:t xml:space="preserve">Complies. The facility works are delivered by a CIRA-registered rehabilitation contractor, as Addendum No. 2 requires, supervised by the Supplier under its single-point accountability. A reconnaissance of the premises has identified the gaps, and the preliminary drawings and bill of quantities quantify the materials, equipment and works. As clarified in the Responses to Queries 003 and 04, new power, HVAC, fire, physical security and secure areas are designed without reliance on existing infrastructure, to the ICT Site Preparation Guide issued in week 4, with works in weeks 7 to 18.</w:t>
             </w:r>
           </w:p>
         </w:tc>
@@ -2155,7 +2155,130 @@
                 <w:i w:val="false"/>
                 <w:iCs w:val="false"/>
               </w:rPr>
-              <w:t xml:space="preserve"/>
+              <w:t xml:space="preserve">System Architecture Sections </w:t>
+            </w:r>
+            <w:fldSimple w:instr="HYPERLINK &quot;Document-5-Technical-Proposal-System-Architecture.docx&quot; \l &quot;sec_1_2&quot;">
+              <w:r>
+                <w:rPr>
+                  <w:rStyle w:val="Hyperlink"/>
+                  <w:b w:val="false"/>
+                  <w:bCs w:val="false"/>
+                  <w:i w:val="false"/>
+                  <w:iCs w:val="false"/>
+                </w:rPr>
+                <w:t xml:space="preserve">1.2</w:t>
+              </w:r>
+            </w:fldSimple>
+            <w:r>
+              <w:rPr>
+                <w:b w:val="false"/>
+                <w:bCs w:val="false"/>
+                <w:i w:val="false"/>
+                <w:iCs w:val="false"/>
+              </w:rPr>
+              <w:t xml:space="preserve"> and </w:t>
+            </w:r>
+            <w:fldSimple w:instr="HYPERLINK &quot;Document-5-Technical-Proposal-System-Architecture.docx&quot; \l &quot;sec_9_5&quot;">
+              <w:r>
+                <w:rPr>
+                  <w:rStyle w:val="Hyperlink"/>
+                  <w:b w:val="false"/>
+                  <w:bCs w:val="false"/>
+                  <w:i w:val="false"/>
+                  <w:iCs w:val="false"/>
+                </w:rPr>
+                <w:t xml:space="preserve">9.5</w:t>
+              </w:r>
+            </w:fldSimple>
+            <w:r>
+              <w:rPr>
+                <w:b w:val="false"/>
+                <w:bCs w:val="false"/>
+                <w:i w:val="false"/>
+                <w:iCs w:val="false"/>
+              </w:rPr>
+              <w:t xml:space="preserve">; </w:t>
+            </w:r>
+            <w:r>
+              <w:rPr>
+                <w:b w:val="false"/>
+                <w:bCs w:val="false"/>
+                <w:i w:val="false"/>
+                <w:iCs w:val="false"/>
+              </w:rPr>
+              <w:t xml:space="preserve">Preliminary Project Plan Sections </w:t>
+            </w:r>
+            <w:fldSimple w:instr="HYPERLINK &quot;Preliminary-Project-Plan-Information-System-Sub-Plans.docx&quot; \l &quot;sec_2_1&quot;">
+              <w:r>
+                <w:rPr>
+                  <w:rStyle w:val="Hyperlink"/>
+                  <w:b w:val="false"/>
+                  <w:bCs w:val="false"/>
+                  <w:i w:val="false"/>
+                  <w:iCs w:val="false"/>
+                </w:rPr>
+                <w:t xml:space="preserve">2.1</w:t>
+              </w:r>
+            </w:fldSimple>
+            <w:r>
+              <w:rPr>
+                <w:b w:val="false"/>
+                <w:bCs w:val="false"/>
+                <w:i w:val="false"/>
+                <w:iCs w:val="false"/>
+              </w:rPr>
+              <w:t xml:space="preserve"> and </w:t>
+            </w:r>
+            <w:fldSimple w:instr="HYPERLINK &quot;Preliminary-Project-Plan-Information-System-Sub-Plans.docx&quot; \l &quot;sec_2_4&quot;">
+              <w:r>
+                <w:rPr>
+                  <w:rStyle w:val="Hyperlink"/>
+                  <w:b w:val="false"/>
+                  <w:bCs w:val="false"/>
+                  <w:i w:val="false"/>
+                  <w:iCs w:val="false"/>
+                </w:rPr>
+                <w:t xml:space="preserve">2.4</w:t>
+              </w:r>
+            </w:fldSimple>
+            <w:r>
+              <w:rPr>
+                <w:b w:val="false"/>
+                <w:bCs w:val="false"/>
+                <w:i w:val="false"/>
+                <w:iCs w:val="false"/>
+              </w:rPr>
+              <w:t xml:space="preserve">; </w:t>
+            </w:r>
+            <w:r>
+              <w:rPr>
+                <w:b w:val="false"/>
+                <w:bCs w:val="false"/>
+                <w:i w:val="false"/>
+                <w:iCs w:val="false"/>
+              </w:rPr>
+              <w:t xml:space="preserve">Cybersecurity Risk Management Plan Section </w:t>
+            </w:r>
+            <w:fldSimple w:instr="HYPERLINK &quot;Cybersecurity-Risk-Management-Plan.docx&quot; \l &quot;sec_2_1&quot;">
+              <w:r>
+                <w:rPr>
+                  <w:rStyle w:val="Hyperlink"/>
+                  <w:b w:val="false"/>
+                  <w:bCs w:val="false"/>
+                  <w:i w:val="false"/>
+                  <w:iCs w:val="false"/>
+                </w:rPr>
+                <w:t xml:space="preserve">2.1</w:t>
+              </w:r>
+            </w:fldSimple>
+            <w:r>
+              <w:rPr>
+                <w:b w:val="false"/>
+                <w:bCs w:val="false"/>
+                <w:i w:val="false"/>
+                <w:iCs w:val="false"/>
+              </w:rPr>
+              <w:t xml:space="preserve">; Attachment: CIRA registration certificate; Attachment: Facility works preliminary drawings; Attachment: Facility works bill of quantities</w:t>
             </w:r>
           </w:p>
         </w:tc>
@@ -3325,9 +3448,9 @@
         </w:tblBorders>
       </w:tblPr>
       <w:tblGrid>
-        <w:gridCol w:w="2042"/>
-        <w:gridCol w:w="4978"/>
         <w:gridCol w:w="2000"/>
+        <w:gridCol w:w="5019"/>
+        <w:gridCol w:w="2001"/>
       </w:tblGrid>
       <w:tr>
         <w:trPr>
@@ -3335,7 +3458,7 @@
         </w:trPr>
         <w:tc>
           <w:tcPr>
-            <w:tcW w:type="dxa" w:w="2042"/>
+            <w:tcW w:type="dxa" w:w="2000"/>
             <w:shd w:fill="EDEDED" w:val="clear"/>
             <w:tcMar>
               <w:top w:type="dxa" w:w="60"/>
@@ -3361,7 +3484,7 @@
         </w:tc>
         <w:tc>
           <w:tcPr>
-            <w:tcW w:type="dxa" w:w="4978"/>
+            <w:tcW w:type="dxa" w:w="5019"/>
             <w:shd w:fill="EDEDED" w:val="clear"/>
             <w:tcMar>
               <w:top w:type="dxa" w:w="60"/>
@@ -3387,7 +3510,7 @@
         </w:tc>
         <w:tc>
           <w:tcPr>
-            <w:tcW w:type="dxa" w:w="2000"/>
+            <w:tcW w:type="dxa" w:w="2001"/>
             <w:shd w:fill="EDEDED" w:val="clear"/>
             <w:tcMar>
               <w:top w:type="dxa" w:w="60"/>
@@ -3415,7 +3538,7 @@
       <w:tr>
         <w:tc>
           <w:tcPr>
-            <w:tcW w:type="dxa" w:w="2042"/>
+            <w:tcW w:type="dxa" w:w="2000"/>
             <w:tcMar>
               <w:top w:type="dxa" w:w="60"/>
               <w:left w:type="dxa" w:w="100"/>
@@ -3449,7 +3572,7 @@
         </w:tc>
         <w:tc>
           <w:tcPr>
-            <w:tcW w:type="dxa" w:w="4978"/>
+            <w:tcW w:type="dxa" w:w="5019"/>
             <w:tcMar>
               <w:top w:type="dxa" w:w="60"/>
               <w:left w:type="dxa" w:w="100"/>
@@ -3474,7 +3597,7 @@
         </w:tc>
         <w:tc>
           <w:tcPr>
-            <w:tcW w:type="dxa" w:w="2000"/>
+            <w:tcW w:type="dxa" w:w="2001"/>
             <w:tcMar>
               <w:top w:type="dxa" w:w="60"/>
               <w:left w:type="dxa" w:w="100"/>
@@ -3576,7 +3699,7 @@
       <w:tr>
         <w:tc>
           <w:tcPr>
-            <w:tcW w:type="dxa" w:w="2042"/>
+            <w:tcW w:type="dxa" w:w="2000"/>
             <w:tcMar>
               <w:top w:type="dxa" w:w="60"/>
               <w:left w:type="dxa" w:w="100"/>
@@ -3610,7 +3733,7 @@
         </w:tc>
         <w:tc>
           <w:tcPr>
-            <w:tcW w:type="dxa" w:w="4978"/>
+            <w:tcW w:type="dxa" w:w="5019"/>
             <w:tcMar>
               <w:top w:type="dxa" w:w="60"/>
               <w:left w:type="dxa" w:w="100"/>
@@ -3635,7 +3758,7 @@
         </w:tc>
         <w:tc>
           <w:tcPr>
-            <w:tcW w:type="dxa" w:w="2000"/>
+            <w:tcW w:type="dxa" w:w="2001"/>
             <w:tcMar>
               <w:top w:type="dxa" w:w="60"/>
               <w:left w:type="dxa" w:w="100"/>
@@ -3716,7 +3839,7 @@
       <w:tr>
         <w:tc>
           <w:tcPr>
-            <w:tcW w:type="dxa" w:w="2042"/>
+            <w:tcW w:type="dxa" w:w="2000"/>
             <w:tcMar>
               <w:top w:type="dxa" w:w="60"/>
               <w:left w:type="dxa" w:w="100"/>
@@ -3750,7 +3873,7 @@
         </w:tc>
         <w:tc>
           <w:tcPr>
-            <w:tcW w:type="dxa" w:w="4978"/>
+            <w:tcW w:type="dxa" w:w="5019"/>
             <w:tcMar>
               <w:top w:type="dxa" w:w="60"/>
               <w:left w:type="dxa" w:w="100"/>
@@ -3775,7 +3898,7 @@
         </w:tc>
         <w:tc>
           <w:tcPr>
-            <w:tcW w:type="dxa" w:w="2000"/>
+            <w:tcW w:type="dxa" w:w="2001"/>
             <w:tcMar>
               <w:top w:type="dxa" w:w="60"/>
               <w:left w:type="dxa" w:w="100"/>
@@ -3856,7 +3979,7 @@
       <w:tr>
         <w:tc>
           <w:tcPr>
-            <w:tcW w:type="dxa" w:w="2042"/>
+            <w:tcW w:type="dxa" w:w="2000"/>
             <w:tcMar>
               <w:top w:type="dxa" w:w="60"/>
               <w:left w:type="dxa" w:w="100"/>
@@ -3890,7 +4013,7 @@
         </w:tc>
         <w:tc>
           <w:tcPr>
-            <w:tcW w:type="dxa" w:w="4978"/>
+            <w:tcW w:type="dxa" w:w="5019"/>
             <w:tcMar>
               <w:top w:type="dxa" w:w="60"/>
               <w:left w:type="dxa" w:w="100"/>
@@ -3915,7 +4038,7 @@
         </w:tc>
         <w:tc>
           <w:tcPr>
-            <w:tcW w:type="dxa" w:w="2000"/>
+            <w:tcW w:type="dxa" w:w="2001"/>
             <w:tcMar>
               <w:top w:type="dxa" w:w="60"/>
               <w:left w:type="dxa" w:w="100"/>
@@ -4047,7 +4170,7 @@
       <w:tr>
         <w:tc>
           <w:tcPr>
-            <w:tcW w:type="dxa" w:w="2042"/>
+            <w:tcW w:type="dxa" w:w="2000"/>
             <w:tcMar>
               <w:top w:type="dxa" w:w="60"/>
               <w:left w:type="dxa" w:w="100"/>
@@ -4081,7 +4204,7 @@
         </w:tc>
         <w:tc>
           <w:tcPr>
-            <w:tcW w:type="dxa" w:w="4978"/>
+            <w:tcW w:type="dxa" w:w="5019"/>
             <w:tcMar>
               <w:top w:type="dxa" w:w="60"/>
               <w:left w:type="dxa" w:w="100"/>
@@ -4106,7 +4229,7 @@
         </w:tc>
         <w:tc>
           <w:tcPr>
-            <w:tcW w:type="dxa" w:w="2000"/>
+            <w:tcW w:type="dxa" w:w="2001"/>
             <w:tcMar>
               <w:top w:type="dxa" w:w="60"/>
               <w:left w:type="dxa" w:w="100"/>
@@ -4187,7 +4310,7 @@
       <w:tr>
         <w:tc>
           <w:tcPr>
-            <w:tcW w:type="dxa" w:w="2042"/>
+            <w:tcW w:type="dxa" w:w="2000"/>
             <w:tcMar>
               <w:top w:type="dxa" w:w="60"/>
               <w:left w:type="dxa" w:w="100"/>
@@ -4221,7 +4344,7 @@
         </w:tc>
         <w:tc>
           <w:tcPr>
-            <w:tcW w:type="dxa" w:w="4978"/>
+            <w:tcW w:type="dxa" w:w="5019"/>
             <w:tcMar>
               <w:top w:type="dxa" w:w="60"/>
               <w:left w:type="dxa" w:w="100"/>
@@ -4246,7 +4369,7 @@
         </w:tc>
         <w:tc>
           <w:tcPr>
-            <w:tcW w:type="dxa" w:w="2000"/>
+            <w:tcW w:type="dxa" w:w="2001"/>
             <w:tcMar>
               <w:top w:type="dxa" w:w="60"/>
               <w:left w:type="dxa" w:w="100"/>
@@ -4315,7 +4438,7 @@
       <w:tr>
         <w:tc>
           <w:tcPr>
-            <w:tcW w:type="dxa" w:w="2042"/>
+            <w:tcW w:type="dxa" w:w="2000"/>
             <w:tcMar>
               <w:top w:type="dxa" w:w="60"/>
               <w:left w:type="dxa" w:w="100"/>
@@ -4349,7 +4472,7 @@
         </w:tc>
         <w:tc>
           <w:tcPr>
-            <w:tcW w:type="dxa" w:w="4978"/>
+            <w:tcW w:type="dxa" w:w="5019"/>
             <w:tcMar>
               <w:top w:type="dxa" w:w="60"/>
               <w:left w:type="dxa" w:w="100"/>
@@ -4374,7 +4497,7 @@
         </w:tc>
         <w:tc>
           <w:tcPr>
-            <w:tcW w:type="dxa" w:w="2000"/>
+            <w:tcW w:type="dxa" w:w="2001"/>
             <w:tcMar>
               <w:top w:type="dxa" w:w="60"/>
               <w:left w:type="dxa" w:w="100"/>
@@ -4476,7 +4599,7 @@
       <w:tr>
         <w:tc>
           <w:tcPr>
-            <w:tcW w:type="dxa" w:w="2042"/>
+            <w:tcW w:type="dxa" w:w="2000"/>
             <w:tcMar>
               <w:top w:type="dxa" w:w="60"/>
               <w:left w:type="dxa" w:w="100"/>
@@ -4510,7 +4633,7 @@
         </w:tc>
         <w:tc>
           <w:tcPr>
-            <w:tcW w:type="dxa" w:w="4978"/>
+            <w:tcW w:type="dxa" w:w="5019"/>
             <w:tcMar>
               <w:top w:type="dxa" w:w="60"/>
               <w:left w:type="dxa" w:w="100"/>
@@ -4535,7 +4658,7 @@
         </w:tc>
         <w:tc>
           <w:tcPr>
-            <w:tcW w:type="dxa" w:w="2000"/>
+            <w:tcW w:type="dxa" w:w="2001"/>
             <w:tcMar>
               <w:top w:type="dxa" w:w="60"/>
               <w:left w:type="dxa" w:w="100"/>
@@ -4595,7 +4718,7 @@
       <w:tr>
         <w:tc>
           <w:tcPr>
-            <w:tcW w:type="dxa" w:w="2042"/>
+            <w:tcW w:type="dxa" w:w="2000"/>
             <w:tcMar>
               <w:top w:type="dxa" w:w="60"/>
               <w:left w:type="dxa" w:w="100"/>
@@ -4629,7 +4752,7 @@
         </w:tc>
         <w:tc>
           <w:tcPr>
-            <w:tcW w:type="dxa" w:w="4978"/>
+            <w:tcW w:type="dxa" w:w="5019"/>
             <w:tcMar>
               <w:top w:type="dxa" w:w="60"/>
               <w:left w:type="dxa" w:w="100"/>
@@ -4654,7 +4777,7 @@
         </w:tc>
         <w:tc>
           <w:tcPr>
-            <w:tcW w:type="dxa" w:w="2000"/>
+            <w:tcW w:type="dxa" w:w="2001"/>
             <w:tcMar>
               <w:top w:type="dxa" w:w="60"/>
               <w:left w:type="dxa" w:w="100"/>
@@ -4756,7 +4879,7 @@
       <w:tr>
         <w:tc>
           <w:tcPr>
-            <w:tcW w:type="dxa" w:w="2042"/>
+            <w:tcW w:type="dxa" w:w="2000"/>
             <w:tcMar>
               <w:top w:type="dxa" w:w="60"/>
               <w:left w:type="dxa" w:w="100"/>
@@ -4790,7 +4913,7 @@
         </w:tc>
         <w:tc>
           <w:tcPr>
-            <w:tcW w:type="dxa" w:w="4978"/>
+            <w:tcW w:type="dxa" w:w="5019"/>
             <w:tcMar>
               <w:top w:type="dxa" w:w="60"/>
               <w:left w:type="dxa" w:w="100"/>
@@ -4815,7 +4938,7 @@
         </w:tc>
         <w:tc>
           <w:tcPr>
-            <w:tcW w:type="dxa" w:w="2000"/>
+            <w:tcW w:type="dxa" w:w="2001"/>
             <w:tcMar>
               <w:top w:type="dxa" w:w="60"/>
               <w:left w:type="dxa" w:w="100"/>
@@ -4980,7 +5103,7 @@
       <w:tr>
         <w:tc>
           <w:tcPr>
-            <w:tcW w:type="dxa" w:w="2042"/>
+            <w:tcW w:type="dxa" w:w="2000"/>
             <w:tcMar>
               <w:top w:type="dxa" w:w="60"/>
               <w:left w:type="dxa" w:w="100"/>
@@ -5014,7 +5137,7 @@
         </w:tc>
         <w:tc>
           <w:tcPr>
-            <w:tcW w:type="dxa" w:w="4978"/>
+            <w:tcW w:type="dxa" w:w="5019"/>
             <w:tcMar>
               <w:top w:type="dxa" w:w="60"/>
               <w:left w:type="dxa" w:w="100"/>
@@ -5039,7 +5162,7 @@
         </w:tc>
         <w:tc>
           <w:tcPr>
-            <w:tcW w:type="dxa" w:w="2000"/>
+            <w:tcW w:type="dxa" w:w="2001"/>
             <w:tcMar>
               <w:top w:type="dxa" w:w="60"/>
               <w:left w:type="dxa" w:w="100"/>
@@ -5162,7 +5285,7 @@
       <w:tr>
         <w:tc>
           <w:tcPr>
-            <w:tcW w:type="dxa" w:w="2042"/>
+            <w:tcW w:type="dxa" w:w="2000"/>
             <w:tcMar>
               <w:top w:type="dxa" w:w="60"/>
               <w:left w:type="dxa" w:w="100"/>
@@ -5196,7 +5319,7 @@
         </w:tc>
         <w:tc>
           <w:tcPr>
-            <w:tcW w:type="dxa" w:w="4978"/>
+            <w:tcW w:type="dxa" w:w="5019"/>
             <w:tcMar>
               <w:top w:type="dxa" w:w="60"/>
               <w:left w:type="dxa" w:w="100"/>
@@ -5221,7 +5344,7 @@
         </w:tc>
         <w:tc>
           <w:tcPr>
-            <w:tcW w:type="dxa" w:w="2000"/>
+            <w:tcW w:type="dxa" w:w="2001"/>
             <w:tcMar>
               <w:top w:type="dxa" w:w="60"/>
               <w:left w:type="dxa" w:w="100"/>
@@ -5302,7 +5425,7 @@
       <w:tr>
         <w:tc>
           <w:tcPr>
-            <w:tcW w:type="dxa" w:w="2042"/>
+            <w:tcW w:type="dxa" w:w="2000"/>
             <w:tcMar>
               <w:top w:type="dxa" w:w="60"/>
               <w:left w:type="dxa" w:w="100"/>
@@ -5336,7 +5459,7 @@
         </w:tc>
         <w:tc>
           <w:tcPr>
-            <w:tcW w:type="dxa" w:w="4978"/>
+            <w:tcW w:type="dxa" w:w="5019"/>
             <w:tcMar>
               <w:top w:type="dxa" w:w="60"/>
               <w:left w:type="dxa" w:w="100"/>
@@ -5361,7 +5484,7 @@
         </w:tc>
         <w:tc>
           <w:tcPr>
-            <w:tcW w:type="dxa" w:w="2000"/>
+            <w:tcW w:type="dxa" w:w="2001"/>
             <w:tcMar>
               <w:top w:type="dxa" w:w="60"/>
               <w:left w:type="dxa" w:w="100"/>
@@ -5442,7 +5565,7 @@
       <w:tr>
         <w:tc>
           <w:tcPr>
-            <w:tcW w:type="dxa" w:w="2042"/>
+            <w:tcW w:type="dxa" w:w="2000"/>
             <w:tcMar>
               <w:top w:type="dxa" w:w="60"/>
               <w:left w:type="dxa" w:w="100"/>
@@ -5476,7 +5599,7 @@
         </w:tc>
         <w:tc>
           <w:tcPr>
-            <w:tcW w:type="dxa" w:w="4978"/>
+            <w:tcW w:type="dxa" w:w="5019"/>
             <w:tcMar>
               <w:top w:type="dxa" w:w="60"/>
               <w:left w:type="dxa" w:w="100"/>
@@ -5501,7 +5624,7 @@
         </w:tc>
         <w:tc>
           <w:tcPr>
-            <w:tcW w:type="dxa" w:w="2000"/>
+            <w:tcW w:type="dxa" w:w="2001"/>
             <w:tcMar>
               <w:top w:type="dxa" w:w="60"/>
               <w:left w:type="dxa" w:w="100"/>
@@ -5603,7 +5726,7 @@
       <w:tr>
         <w:tc>
           <w:tcPr>
-            <w:tcW w:type="dxa" w:w="2042"/>
+            <w:tcW w:type="dxa" w:w="2000"/>
             <w:tcMar>
               <w:top w:type="dxa" w:w="60"/>
               <w:left w:type="dxa" w:w="100"/>
@@ -5637,7 +5760,7 @@
         </w:tc>
         <w:tc>
           <w:tcPr>
-            <w:tcW w:type="dxa" w:w="4978"/>
+            <w:tcW w:type="dxa" w:w="5019"/>
             <w:tcMar>
               <w:top w:type="dxa" w:w="60"/>
               <w:left w:type="dxa" w:w="100"/>
@@ -5662,7 +5785,7 @@
         </w:tc>
         <w:tc>
           <w:tcPr>
-            <w:tcW w:type="dxa" w:w="2000"/>
+            <w:tcW w:type="dxa" w:w="2001"/>
             <w:tcMar>
               <w:top w:type="dxa" w:w="60"/>
               <w:left w:type="dxa" w:w="100"/>
@@ -5743,7 +5866,7 @@
       <w:tr>
         <w:tc>
           <w:tcPr>
-            <w:tcW w:type="dxa" w:w="2042"/>
+            <w:tcW w:type="dxa" w:w="2000"/>
             <w:tcMar>
               <w:top w:type="dxa" w:w="60"/>
               <w:left w:type="dxa" w:w="100"/>
@@ -5777,7 +5900,7 @@
         </w:tc>
         <w:tc>
           <w:tcPr>
-            <w:tcW w:type="dxa" w:w="4978"/>
+            <w:tcW w:type="dxa" w:w="5019"/>
             <w:tcMar>
               <w:top w:type="dxa" w:w="60"/>
               <w:left w:type="dxa" w:w="100"/>
@@ -5802,7 +5925,7 @@
         </w:tc>
         <w:tc>
           <w:tcPr>
-            <w:tcW w:type="dxa" w:w="2000"/>
+            <w:tcW w:type="dxa" w:w="2001"/>
             <w:tcMar>
               <w:top w:type="dxa" w:w="60"/>
               <w:left w:type="dxa" w:w="100"/>
@@ -5883,7 +6006,7 @@
       <w:tr>
         <w:tc>
           <w:tcPr>
-            <w:tcW w:type="dxa" w:w="2042"/>
+            <w:tcW w:type="dxa" w:w="2000"/>
             <w:tcMar>
               <w:top w:type="dxa" w:w="60"/>
               <w:left w:type="dxa" w:w="100"/>
@@ -5917,7 +6040,7 @@
         </w:tc>
         <w:tc>
           <w:tcPr>
-            <w:tcW w:type="dxa" w:w="4978"/>
+            <w:tcW w:type="dxa" w:w="5019"/>
             <w:tcMar>
               <w:top w:type="dxa" w:w="60"/>
               <w:left w:type="dxa" w:w="100"/>
@@ -5942,7 +6065,7 @@
         </w:tc>
         <w:tc>
           <w:tcPr>
-            <w:tcW w:type="dxa" w:w="2000"/>
+            <w:tcW w:type="dxa" w:w="2001"/>
             <w:tcMar>
               <w:top w:type="dxa" w:w="60"/>
               <w:left w:type="dxa" w:w="100"/>
@@ -6044,7 +6167,7 @@
       <w:tr>
         <w:tc>
           <w:tcPr>
-            <w:tcW w:type="dxa" w:w="2042"/>
+            <w:tcW w:type="dxa" w:w="2000"/>
             <w:tcMar>
               <w:top w:type="dxa" w:w="60"/>
               <w:left w:type="dxa" w:w="100"/>
@@ -6078,7 +6201,7 @@
         </w:tc>
         <w:tc>
           <w:tcPr>
-            <w:tcW w:type="dxa" w:w="4978"/>
+            <w:tcW w:type="dxa" w:w="5019"/>
             <w:tcMar>
               <w:top w:type="dxa" w:w="60"/>
               <w:left w:type="dxa" w:w="100"/>
@@ -6103,7 +6226,7 @@
         </w:tc>
         <w:tc>
           <w:tcPr>
-            <w:tcW w:type="dxa" w:w="2000"/>
+            <w:tcW w:type="dxa" w:w="2001"/>
             <w:tcMar>
               <w:top w:type="dxa" w:w="60"/>
               <w:left w:type="dxa" w:w="100"/>
@@ -6163,7 +6286,7 @@
       <w:tr>
         <w:tc>
           <w:tcPr>
-            <w:tcW w:type="dxa" w:w="2042"/>
+            <w:tcW w:type="dxa" w:w="2000"/>
             <w:tcMar>
               <w:top w:type="dxa" w:w="60"/>
               <w:left w:type="dxa" w:w="100"/>
@@ -6197,7 +6320,7 @@
         </w:tc>
         <w:tc>
           <w:tcPr>
-            <w:tcW w:type="dxa" w:w="4978"/>
+            <w:tcW w:type="dxa" w:w="5019"/>
             <w:tcMar>
               <w:top w:type="dxa" w:w="60"/>
               <w:left w:type="dxa" w:w="100"/>
@@ -6222,7 +6345,7 @@
         </w:tc>
         <w:tc>
           <w:tcPr>
-            <w:tcW w:type="dxa" w:w="2000"/>
+            <w:tcW w:type="dxa" w:w="2001"/>
             <w:tcMar>
               <w:top w:type="dxa" w:w="60"/>
               <w:left w:type="dxa" w:w="100"/>
@@ -6342,7 +6465,7 @@
       <w:tr>
         <w:tc>
           <w:tcPr>
-            <w:tcW w:type="dxa" w:w="2042"/>
+            <w:tcW w:type="dxa" w:w="2000"/>
             <w:tcMar>
               <w:top w:type="dxa" w:w="60"/>
               <w:left w:type="dxa" w:w="100"/>
@@ -6376,7 +6499,7 @@
         </w:tc>
         <w:tc>
           <w:tcPr>
-            <w:tcW w:type="dxa" w:w="4978"/>
+            <w:tcW w:type="dxa" w:w="5019"/>
             <w:tcMar>
               <w:top w:type="dxa" w:w="60"/>
               <w:left w:type="dxa" w:w="100"/>
@@ -6401,7 +6524,7 @@
         </w:tc>
         <w:tc>
           <w:tcPr>
-            <w:tcW w:type="dxa" w:w="2000"/>
+            <w:tcW w:type="dxa" w:w="2001"/>
             <w:tcMar>
               <w:top w:type="dxa" w:w="60"/>
               <w:left w:type="dxa" w:w="100"/>
@@ -6470,7 +6593,7 @@
       <w:tr>
         <w:tc>
           <w:tcPr>
-            <w:tcW w:type="dxa" w:w="2042"/>
+            <w:tcW w:type="dxa" w:w="2000"/>
             <w:tcMar>
               <w:top w:type="dxa" w:w="60"/>
               <w:left w:type="dxa" w:w="100"/>
@@ -6504,7 +6627,7 @@
         </w:tc>
         <w:tc>
           <w:tcPr>
-            <w:tcW w:type="dxa" w:w="4978"/>
+            <w:tcW w:type="dxa" w:w="5019"/>
             <w:tcMar>
               <w:top w:type="dxa" w:w="60"/>
               <w:left w:type="dxa" w:w="100"/>
@@ -6529,7 +6652,7 @@
         </w:tc>
         <w:tc>
           <w:tcPr>
-            <w:tcW w:type="dxa" w:w="2000"/>
+            <w:tcW w:type="dxa" w:w="2001"/>
             <w:tcMar>
               <w:top w:type="dxa" w:w="60"/>
               <w:left w:type="dxa" w:w="100"/>
@@ -6640,7 +6763,7 @@
       <w:tr>
         <w:tc>
           <w:tcPr>
-            <w:tcW w:type="dxa" w:w="2042"/>
+            <w:tcW w:type="dxa" w:w="2000"/>
             <w:tcMar>
               <w:top w:type="dxa" w:w="60"/>
               <w:left w:type="dxa" w:w="100"/>
@@ -6674,7 +6797,7 @@
         </w:tc>
         <w:tc>
           <w:tcPr>
-            <w:tcW w:type="dxa" w:w="4978"/>
+            <w:tcW w:type="dxa" w:w="5019"/>
             <w:tcMar>
               <w:top w:type="dxa" w:w="60"/>
               <w:left w:type="dxa" w:w="100"/>
@@ -6699,7 +6822,7 @@
         </w:tc>
         <w:tc>
           <w:tcPr>
-            <w:tcW w:type="dxa" w:w="2000"/>
+            <w:tcW w:type="dxa" w:w="2001"/>
             <w:tcMar>
               <w:top w:type="dxa" w:w="60"/>
               <w:left w:type="dxa" w:w="100"/>
@@ -6861,7 +6984,7 @@
       <w:tr>
         <w:tc>
           <w:tcPr>
-            <w:tcW w:type="dxa" w:w="2042"/>
+            <w:tcW w:type="dxa" w:w="2000"/>
             <w:tcMar>
               <w:top w:type="dxa" w:w="60"/>
               <w:left w:type="dxa" w:w="100"/>
@@ -6895,51 +7018,114 @@
         </w:tc>
         <w:tc>
           <w:tcPr>
-            <w:tcW w:type="dxa" w:w="4978"/>
-            <w:tcMar>
-              <w:top w:type="dxa" w:w="60"/>
-              <w:left w:type="dxa" w:w="100"/>
-              <w:bottom w:type="dxa" w:w="60"/>
-              <w:right w:type="dxa" w:w="100"/>
-            </w:tcMar>
-          </w:tcPr>
-          <w:p>
-            <w:pPr>
-              <w:spacing w:after="0" w:before="0"/>
-            </w:pPr>
-            <w:r>
-              <w:rPr>
-                <w:b w:val="false"/>
-                <w:bCs w:val="false"/>
-                <w:i w:val="false"/>
-                <w:iCs w:val="false"/>
-              </w:rPr>
-              <w:t xml:space="preserve"/>
-            </w:r>
-          </w:p>
-        </w:tc>
-        <w:tc>
-          <w:tcPr>
-            <w:tcW w:type="dxa" w:w="2000"/>
-            <w:tcMar>
-              <w:top w:type="dxa" w:w="60"/>
-              <w:left w:type="dxa" w:w="100"/>
-              <w:bottom w:type="dxa" w:w="60"/>
-              <w:right w:type="dxa" w:w="100"/>
-            </w:tcMar>
-          </w:tcPr>
-          <w:p>
-            <w:pPr>
-              <w:spacing w:after="0" w:before="0"/>
-            </w:pPr>
-            <w:r>
-              <w:rPr>
-                <w:b w:val="false"/>
-                <w:bCs w:val="false"/>
-                <w:i w:val="false"/>
-                <w:iCs w:val="false"/>
-              </w:rPr>
-              <w:t xml:space="preserve"/>
+            <w:tcW w:type="dxa" w:w="5019"/>
+            <w:tcMar>
+              <w:top w:type="dxa" w:w="60"/>
+              <w:left w:type="dxa" w:w="100"/>
+              <w:bottom w:type="dxa" w:w="60"/>
+              <w:right w:type="dxa" w:w="100"/>
+            </w:tcMar>
+          </w:tcPr>
+          <w:p>
+            <w:pPr>
+              <w:spacing w:after="0" w:before="0"/>
+            </w:pPr>
+            <w:r>
+              <w:rPr>
+                <w:b w:val="false"/>
+                <w:bCs w:val="false"/>
+                <w:i w:val="false"/>
+                <w:iCs w:val="false"/>
+              </w:rPr>
+              <w:t xml:space="preserve">Complies. The facility works provide uninterruptible power supply, a 50 kVA standby generator in its own housing, a main control board combining the utility, generator and UPS supplies with automatic transfer, rack power distribution units and grounding; air conditioning with humidity control, precision cooling, air filtration and environmental monitoring linked to alerting; and ZKTeco biometric access control, Hikvision closed circuit television, intrusion detection and clean agent fire suppression. As clarified in the Responses to Queries 003 and 04, none relies on existing site infrastructure, and the Purchaser supplies a separate, dedicated power connection to the approved design.</w:t>
+            </w:r>
+          </w:p>
+        </w:tc>
+        <w:tc>
+          <w:tcPr>
+            <w:tcW w:type="dxa" w:w="2001"/>
+            <w:tcMar>
+              <w:top w:type="dxa" w:w="60"/>
+              <w:left w:type="dxa" w:w="100"/>
+              <w:bottom w:type="dxa" w:w="60"/>
+              <w:right w:type="dxa" w:w="100"/>
+            </w:tcMar>
+          </w:tcPr>
+          <w:p>
+            <w:pPr>
+              <w:spacing w:after="0" w:before="0"/>
+            </w:pPr>
+            <w:r>
+              <w:rPr>
+                <w:b w:val="false"/>
+                <w:bCs w:val="false"/>
+                <w:i w:val="false"/>
+                <w:iCs w:val="false"/>
+              </w:rPr>
+              <w:t xml:space="preserve">System Architecture Sections </w:t>
+            </w:r>
+            <w:fldSimple w:instr="HYPERLINK &quot;Document-5-Technical-Proposal-System-Architecture.docx&quot; \l &quot;sec_9_2&quot;">
+              <w:r>
+                <w:rPr>
+                  <w:rStyle w:val="Hyperlink"/>
+                  <w:b w:val="false"/>
+                  <w:bCs w:val="false"/>
+                  <w:i w:val="false"/>
+                  <w:iCs w:val="false"/>
+                </w:rPr>
+                <w:t xml:space="preserve">9.2</w:t>
+              </w:r>
+            </w:fldSimple>
+            <w:r>
+              <w:rPr>
+                <w:b w:val="false"/>
+                <w:bCs w:val="false"/>
+                <w:i w:val="false"/>
+                <w:iCs w:val="false"/>
+              </w:rPr>
+              <w:t xml:space="preserve">, </w:t>
+            </w:r>
+            <w:fldSimple w:instr="HYPERLINK &quot;Document-5-Technical-Proposal-System-Architecture.docx&quot; \l &quot;sec_9_5&quot;">
+              <w:r>
+                <w:rPr>
+                  <w:rStyle w:val="Hyperlink"/>
+                  <w:b w:val="false"/>
+                  <w:bCs w:val="false"/>
+                  <w:i w:val="false"/>
+                  <w:iCs w:val="false"/>
+                </w:rPr>
+                <w:t xml:space="preserve">9.5</w:t>
+              </w:r>
+            </w:fldSimple>
+            <w:r>
+              <w:rPr>
+                <w:b w:val="false"/>
+                <w:bCs w:val="false"/>
+                <w:i w:val="false"/>
+                <w:iCs w:val="false"/>
+              </w:rPr>
+              <w:t xml:space="preserve"> and </w:t>
+            </w:r>
+            <w:fldSimple w:instr="HYPERLINK &quot;Document-5-Technical-Proposal-System-Architecture.docx&quot; \l &quot;sec_13_1&quot;">
+              <w:r>
+                <w:rPr>
+                  <w:rStyle w:val="Hyperlink"/>
+                  <w:b w:val="false"/>
+                  <w:bCs w:val="false"/>
+                  <w:i w:val="false"/>
+                  <w:iCs w:val="false"/>
+                </w:rPr>
+                <w:t xml:space="preserve">13.1</w:t>
+              </w:r>
+            </w:fldSimple>
+            <w:r>
+              <w:rPr>
+                <w:b w:val="false"/>
+                <w:bCs w:val="false"/>
+                <w:i w:val="false"/>
+                <w:iCs w:val="false"/>
+              </w:rPr>
+              <w:t xml:space="preserve">; Attachment: Facility works bill of quantities</w:t>
             </w:r>
           </w:p>
         </w:tc>
@@ -6947,7 +7133,7 @@
       <w:tr>
         <w:tc>
           <w:tcPr>
-            <w:tcW w:type="dxa" w:w="2042"/>
+            <w:tcW w:type="dxa" w:w="2000"/>
             <w:tcMar>
               <w:top w:type="dxa" w:w="60"/>
               <w:left w:type="dxa" w:w="100"/>
@@ -6981,7 +7167,7 @@
         </w:tc>
         <w:tc>
           <w:tcPr>
-            <w:tcW w:type="dxa" w:w="4978"/>
+            <w:tcW w:type="dxa" w:w="5019"/>
             <w:tcMar>
               <w:top w:type="dxa" w:w="60"/>
               <w:left w:type="dxa" w:w="100"/>
@@ -7006,7 +7192,7 @@
         </w:tc>
         <w:tc>
           <w:tcPr>
-            <w:tcW w:type="dxa" w:w="2000"/>
+            <w:tcW w:type="dxa" w:w="2001"/>
             <w:tcMar>
               <w:top w:type="dxa" w:w="60"/>
               <w:left w:type="dxa" w:w="100"/>
@@ -7066,7 +7252,7 @@
       <w:tr>
         <w:tc>
           <w:tcPr>
-            <w:tcW w:type="dxa" w:w="2042"/>
+            <w:tcW w:type="dxa" w:w="2000"/>
             <w:tcMar>
               <w:top w:type="dxa" w:w="60"/>
               <w:left w:type="dxa" w:w="100"/>
@@ -7100,7 +7286,7 @@
         </w:tc>
         <w:tc>
           <w:tcPr>
-            <w:tcW w:type="dxa" w:w="4978"/>
+            <w:tcW w:type="dxa" w:w="5019"/>
             <w:tcMar>
               <w:top w:type="dxa" w:w="60"/>
               <w:left w:type="dxa" w:w="100"/>
@@ -7125,7 +7311,7 @@
         </w:tc>
         <w:tc>
           <w:tcPr>
-            <w:tcW w:type="dxa" w:w="2000"/>
+            <w:tcW w:type="dxa" w:w="2001"/>
             <w:tcMar>
               <w:top w:type="dxa" w:w="60"/>
               <w:left w:type="dxa" w:w="100"/>
@@ -20025,8 +20211,8 @@
         </w:tblBorders>
       </w:tblPr>
       <w:tblGrid>
-        <w:gridCol w:w="2193"/>
-        <w:gridCol w:w="4827"/>
+        <w:gridCol w:w="2089"/>
+        <w:gridCol w:w="4931"/>
         <w:gridCol w:w="2000"/>
       </w:tblGrid>
       <w:tr>
@@ -20035,7 +20221,7 @@
         </w:trPr>
         <w:tc>
           <w:tcPr>
-            <w:tcW w:type="dxa" w:w="2193"/>
+            <w:tcW w:type="dxa" w:w="2089"/>
             <w:shd w:fill="EDEDED" w:val="clear"/>
             <w:tcMar>
               <w:top w:type="dxa" w:w="60"/>
@@ -20061,7 +20247,7 @@
         </w:tc>
         <w:tc>
           <w:tcPr>
-            <w:tcW w:type="dxa" w:w="4827"/>
+            <w:tcW w:type="dxa" w:w="4931"/>
             <w:shd w:fill="EDEDED" w:val="clear"/>
             <w:tcMar>
               <w:top w:type="dxa" w:w="60"/>
@@ -20115,7 +20301,7 @@
       <w:tr>
         <w:tc>
           <w:tcPr>
-            <w:tcW w:type="dxa" w:w="2193"/>
+            <w:tcW w:type="dxa" w:w="2089"/>
             <w:tcMar>
               <w:top w:type="dxa" w:w="60"/>
               <w:left w:type="dxa" w:w="100"/>
@@ -20149,7 +20335,7 @@
         </w:tc>
         <w:tc>
           <w:tcPr>
-            <w:tcW w:type="dxa" w:w="4827"/>
+            <w:tcW w:type="dxa" w:w="4931"/>
             <w:tcMar>
               <w:top w:type="dxa" w:w="60"/>
               <w:left w:type="dxa" w:w="100"/>
@@ -20234,7 +20420,7 @@
       <w:tr>
         <w:tc>
           <w:tcPr>
-            <w:tcW w:type="dxa" w:w="2193"/>
+            <w:tcW w:type="dxa" w:w="2089"/>
             <w:tcMar>
               <w:top w:type="dxa" w:w="60"/>
               <w:left w:type="dxa" w:w="100"/>
@@ -20268,7 +20454,7 @@
         </w:tc>
         <w:tc>
           <w:tcPr>
-            <w:tcW w:type="dxa" w:w="4827"/>
+            <w:tcW w:type="dxa" w:w="4931"/>
             <w:tcMar>
               <w:top w:type="dxa" w:w="60"/>
               <w:left w:type="dxa" w:w="100"/>
@@ -20332,7 +20518,7 @@
       <w:tr>
         <w:tc>
           <w:tcPr>
-            <w:tcW w:type="dxa" w:w="2193"/>
+            <w:tcW w:type="dxa" w:w="2089"/>
             <w:tcMar>
               <w:top w:type="dxa" w:w="60"/>
               <w:left w:type="dxa" w:w="100"/>
@@ -20366,7 +20552,7 @@
         </w:tc>
         <w:tc>
           <w:tcPr>
-            <w:tcW w:type="dxa" w:w="4827"/>
+            <w:tcW w:type="dxa" w:w="4931"/>
             <w:tcMar>
               <w:top w:type="dxa" w:w="60"/>
               <w:left w:type="dxa" w:w="100"/>
@@ -20451,7 +20637,7 @@
       <w:tr>
         <w:tc>
           <w:tcPr>
-            <w:tcW w:type="dxa" w:w="2193"/>
+            <w:tcW w:type="dxa" w:w="2089"/>
             <w:tcMar>
               <w:top w:type="dxa" w:w="60"/>
               <w:left w:type="dxa" w:w="100"/>
@@ -20485,7 +20671,7 @@
         </w:tc>
         <w:tc>
           <w:tcPr>
-            <w:tcW w:type="dxa" w:w="4827"/>
+            <w:tcW w:type="dxa" w:w="4931"/>
             <w:tcMar>
               <w:top w:type="dxa" w:w="60"/>
               <w:left w:type="dxa" w:w="100"/>
@@ -20570,7 +20756,7 @@
       <w:tr>
         <w:tc>
           <w:tcPr>
-            <w:tcW w:type="dxa" w:w="2193"/>
+            <w:tcW w:type="dxa" w:w="2089"/>
             <w:tcMar>
               <w:top w:type="dxa" w:w="60"/>
               <w:left w:type="dxa" w:w="100"/>
@@ -20604,7 +20790,7 @@
         </w:tc>
         <w:tc>
           <w:tcPr>
-            <w:tcW w:type="dxa" w:w="4827"/>
+            <w:tcW w:type="dxa" w:w="4931"/>
             <w:tcMar>
               <w:top w:type="dxa" w:w="60"/>
               <w:left w:type="dxa" w:w="100"/>
@@ -20749,7 +20935,7 @@
       <w:tr>
         <w:tc>
           <w:tcPr>
-            <w:tcW w:type="dxa" w:w="2193"/>
+            <w:tcW w:type="dxa" w:w="2089"/>
             <w:tcMar>
               <w:top w:type="dxa" w:w="60"/>
               <w:left w:type="dxa" w:w="100"/>
@@ -20783,7 +20969,7 @@
         </w:tc>
         <w:tc>
           <w:tcPr>
-            <w:tcW w:type="dxa" w:w="4827"/>
+            <w:tcW w:type="dxa" w:w="4931"/>
             <w:tcMar>
               <w:top w:type="dxa" w:w="60"/>
               <w:left w:type="dxa" w:w="100"/>
@@ -20919,7 +21105,7 @@
       <w:tr>
         <w:tc>
           <w:tcPr>
-            <w:tcW w:type="dxa" w:w="2193"/>
+            <w:tcW w:type="dxa" w:w="2089"/>
             <w:tcMar>
               <w:top w:type="dxa" w:w="60"/>
               <w:left w:type="dxa" w:w="100"/>
@@ -20953,7 +21139,7 @@
         </w:tc>
         <w:tc>
           <w:tcPr>
-            <w:tcW w:type="dxa" w:w="4827"/>
+            <w:tcW w:type="dxa" w:w="4931"/>
             <w:tcMar>
               <w:top w:type="dxa" w:w="60"/>
               <w:left w:type="dxa" w:w="100"/>
@@ -21047,7 +21233,7 @@
       <w:tr>
         <w:tc>
           <w:tcPr>
-            <w:tcW w:type="dxa" w:w="2193"/>
+            <w:tcW w:type="dxa" w:w="2089"/>
             <w:tcMar>
               <w:top w:type="dxa" w:w="60"/>
               <w:left w:type="dxa" w:w="100"/>
@@ -21081,7 +21267,7 @@
         </w:tc>
         <w:tc>
           <w:tcPr>
-            <w:tcW w:type="dxa" w:w="4827"/>
+            <w:tcW w:type="dxa" w:w="4931"/>
             <w:tcMar>
               <w:top w:type="dxa" w:w="60"/>
               <w:left w:type="dxa" w:w="100"/>
@@ -21217,7 +21403,7 @@
       <w:tr>
         <w:tc>
           <w:tcPr>
-            <w:tcW w:type="dxa" w:w="2193"/>
+            <w:tcW w:type="dxa" w:w="2089"/>
             <w:tcMar>
               <w:top w:type="dxa" w:w="60"/>
               <w:left w:type="dxa" w:w="100"/>
@@ -21251,7 +21437,7 @@
         </w:tc>
         <w:tc>
           <w:tcPr>
-            <w:tcW w:type="dxa" w:w="4827"/>
+            <w:tcW w:type="dxa" w:w="4931"/>
             <w:tcMar>
               <w:top w:type="dxa" w:w="60"/>
               <w:left w:type="dxa" w:w="100"/>
@@ -21345,7 +21531,7 @@
       <w:tr>
         <w:tc>
           <w:tcPr>
-            <w:tcW w:type="dxa" w:w="2193"/>
+            <w:tcW w:type="dxa" w:w="2089"/>
             <w:tcMar>
               <w:top w:type="dxa" w:w="60"/>
               <w:left w:type="dxa" w:w="100"/>
@@ -21379,7 +21565,7 @@
         </w:tc>
         <w:tc>
           <w:tcPr>
-            <w:tcW w:type="dxa" w:w="4827"/>
+            <w:tcW w:type="dxa" w:w="4931"/>
             <w:tcMar>
               <w:top w:type="dxa" w:w="60"/>
               <w:left w:type="dxa" w:w="100"/>
@@ -21494,7 +21680,7 @@
       <w:tr>
         <w:tc>
           <w:tcPr>
-            <w:tcW w:type="dxa" w:w="2193"/>
+            <w:tcW w:type="dxa" w:w="2089"/>
             <w:tcMar>
               <w:top w:type="dxa" w:w="60"/>
               <w:left w:type="dxa" w:w="100"/>
@@ -21528,7 +21714,7 @@
         </w:tc>
         <w:tc>
           <w:tcPr>
-            <w:tcW w:type="dxa" w:w="4827"/>
+            <w:tcW w:type="dxa" w:w="4931"/>
             <w:tcMar>
               <w:top w:type="dxa" w:w="60"/>
               <w:left w:type="dxa" w:w="100"/>
@@ -21664,7 +21850,7 @@
       <w:tr>
         <w:tc>
           <w:tcPr>
-            <w:tcW w:type="dxa" w:w="2193"/>
+            <w:tcW w:type="dxa" w:w="2089"/>
             <w:tcMar>
               <w:top w:type="dxa" w:w="60"/>
               <w:left w:type="dxa" w:w="100"/>
@@ -21698,7 +21884,7 @@
         </w:tc>
         <w:tc>
           <w:tcPr>
-            <w:tcW w:type="dxa" w:w="4827"/>
+            <w:tcW w:type="dxa" w:w="4931"/>
             <w:tcMar>
               <w:top w:type="dxa" w:w="60"/>
               <w:left w:type="dxa" w:w="100"/>
@@ -21813,7 +21999,7 @@
       <w:tr>
         <w:tc>
           <w:tcPr>
-            <w:tcW w:type="dxa" w:w="2193"/>
+            <w:tcW w:type="dxa" w:w="2089"/>
             <w:tcMar>
               <w:top w:type="dxa" w:w="60"/>
               <w:left w:type="dxa" w:w="100"/>
@@ -21847,7 +22033,7 @@
         </w:tc>
         <w:tc>
           <w:tcPr>
-            <w:tcW w:type="dxa" w:w="4827"/>
+            <w:tcW w:type="dxa" w:w="4931"/>
             <w:tcMar>
               <w:top w:type="dxa" w:w="60"/>
               <w:left w:type="dxa" w:w="100"/>
@@ -21962,7 +22148,7 @@
       <w:tr>
         <w:tc>
           <w:tcPr>
-            <w:tcW w:type="dxa" w:w="2193"/>
+            <w:tcW w:type="dxa" w:w="2089"/>
             <w:tcMar>
               <w:top w:type="dxa" w:w="60"/>
               <w:left w:type="dxa" w:w="100"/>
@@ -21996,7 +22182,7 @@
         </w:tc>
         <w:tc>
           <w:tcPr>
-            <w:tcW w:type="dxa" w:w="4827"/>
+            <w:tcW w:type="dxa" w:w="4931"/>
             <w:tcMar>
               <w:top w:type="dxa" w:w="60"/>
               <w:left w:type="dxa" w:w="100"/>
@@ -22102,7 +22288,7 @@
       <w:tr>
         <w:tc>
           <w:tcPr>
-            <w:tcW w:type="dxa" w:w="2193"/>
+            <w:tcW w:type="dxa" w:w="2089"/>
             <w:tcMar>
               <w:top w:type="dxa" w:w="60"/>
               <w:left w:type="dxa" w:w="100"/>
@@ -22136,7 +22322,7 @@
         </w:tc>
         <w:tc>
           <w:tcPr>
-            <w:tcW w:type="dxa" w:w="4827"/>
+            <w:tcW w:type="dxa" w:w="4931"/>
             <w:tcMar>
               <w:top w:type="dxa" w:w="60"/>
               <w:left w:type="dxa" w:w="100"/>
@@ -22251,7 +22437,7 @@
       <w:tr>
         <w:tc>
           <w:tcPr>
-            <w:tcW w:type="dxa" w:w="2193"/>
+            <w:tcW w:type="dxa" w:w="2089"/>
             <w:tcMar>
               <w:top w:type="dxa" w:w="60"/>
               <w:left w:type="dxa" w:w="100"/>
@@ -22285,26 +22471,26 @@
         </w:tc>
         <w:tc>
           <w:tcPr>
-            <w:tcW w:type="dxa" w:w="4827"/>
-            <w:tcMar>
-              <w:top w:type="dxa" w:w="60"/>
-              <w:left w:type="dxa" w:w="100"/>
-              <w:bottom w:type="dxa" w:w="60"/>
-              <w:right w:type="dxa" w:w="100"/>
-            </w:tcMar>
-          </w:tcPr>
-          <w:p>
-            <w:pPr>
-              <w:spacing w:after="0" w:before="0"/>
-            </w:pPr>
-            <w:r>
-              <w:rPr>
-                <w:b w:val="false"/>
-                <w:bCs w:val="false"/>
-                <w:i w:val="false"/>
-                <w:iCs w:val="false"/>
-              </w:rPr>
-              <w:t xml:space="preserve"/>
+            <w:tcW w:type="dxa" w:w="4931"/>
+            <w:tcMar>
+              <w:top w:type="dxa" w:w="60"/>
+              <w:left w:type="dxa" w:w="100"/>
+              <w:bottom w:type="dxa" w:w="60"/>
+              <w:right w:type="dxa" w:w="100"/>
+            </w:tcMar>
+          </w:tcPr>
+          <w:p>
+            <w:pPr>
+              <w:spacing w:after="0" w:before="0"/>
+            </w:pPr>
+            <w:r>
+              <w:rPr>
+                <w:b w:val="false"/>
+                <w:bCs w:val="false"/>
+                <w:i w:val="false"/>
+                <w:iCs w:val="false"/>
+              </w:rPr>
+              <w:t xml:space="preserve">Complies. Preliminary drawings of the proposed facility are attached, and detailed shop drawings are submitted to the Purchaser for approval before the works start. Electrical drawings, UPS configuration, generator integration, HVAC, fire suppression, access control, CCTV, structured cabling, raised floor and environmental monitoring documentation are delivered with the facility works, in as-built form at handover.</w:t>
             </w:r>
           </w:p>
         </w:tc>
@@ -22329,7 +22515,58 @@
                 <w:i w:val="false"/>
                 <w:iCs w:val="false"/>
               </w:rPr>
-              <w:t xml:space="preserve"/>
+              <w:t xml:space="preserve">Preliminary Project Plan Section </w:t>
+            </w:r>
+            <w:fldSimple w:instr="HYPERLINK &quot;Preliminary-Project-Plan-Information-System-Sub-Plans.docx&quot; \l &quot;sec_2_10&quot;">
+              <w:r>
+                <w:rPr>
+                  <w:rStyle w:val="Hyperlink"/>
+                  <w:b w:val="false"/>
+                  <w:bCs w:val="false"/>
+                  <w:i w:val="false"/>
+                  <w:iCs w:val="false"/>
+                </w:rPr>
+                <w:t xml:space="preserve">2.10</w:t>
+              </w:r>
+            </w:fldSimple>
+            <w:r>
+              <w:rPr>
+                <w:b w:val="false"/>
+                <w:bCs w:val="false"/>
+                <w:i w:val="false"/>
+                <w:iCs w:val="false"/>
+              </w:rPr>
+              <w:t xml:space="preserve">; </w:t>
+            </w:r>
+            <w:r>
+              <w:rPr>
+                <w:b w:val="false"/>
+                <w:bCs w:val="false"/>
+                <w:i w:val="false"/>
+                <w:iCs w:val="false"/>
+              </w:rPr>
+              <w:t xml:space="preserve">System Architecture Section </w:t>
+            </w:r>
+            <w:fldSimple w:instr="HYPERLINK &quot;Document-5-Technical-Proposal-System-Architecture.docx&quot; \l &quot;sec_9_5&quot;">
+              <w:r>
+                <w:rPr>
+                  <w:rStyle w:val="Hyperlink"/>
+                  <w:b w:val="false"/>
+                  <w:bCs w:val="false"/>
+                  <w:i w:val="false"/>
+                  <w:iCs w:val="false"/>
+                </w:rPr>
+                <w:t xml:space="preserve">9.5</w:t>
+              </w:r>
+            </w:fldSimple>
+            <w:r>
+              <w:rPr>
+                <w:b w:val="false"/>
+                <w:bCs w:val="false"/>
+                <w:i w:val="false"/>
+                <w:iCs w:val="false"/>
+              </w:rPr>
+              <w:t xml:space="preserve">; Attachment: Facility works preliminary drawings</w:t>
             </w:r>
           </w:p>
         </w:tc>
@@ -22337,7 +22574,7 @@
       <w:tr>
         <w:tc>
           <w:tcPr>
-            <w:tcW w:type="dxa" w:w="2193"/>
+            <w:tcW w:type="dxa" w:w="2089"/>
             <w:tcMar>
               <w:top w:type="dxa" w:w="60"/>
               <w:left w:type="dxa" w:w="100"/>
@@ -22371,7 +22608,7 @@
         </w:tc>
         <w:tc>
           <w:tcPr>
-            <w:tcW w:type="dxa" w:w="4827"/>
+            <w:tcW w:type="dxa" w:w="4931"/>
             <w:tcMar>
               <w:top w:type="dxa" w:w="60"/>
               <w:left w:type="dxa" w:w="100"/>
@@ -31457,8 +31694,8 @@
         </w:tblBorders>
       </w:tblPr>
       <w:tblGrid>
-        <w:gridCol w:w="4251"/>
-        <w:gridCol w:w="2769"/>
+        <w:gridCol w:w="2110"/>
+        <w:gridCol w:w="4910"/>
         <w:gridCol w:w="2000"/>
       </w:tblGrid>
       <w:tr>
@@ -31467,7 +31704,7 @@
         </w:trPr>
         <w:tc>
           <w:tcPr>
-            <w:tcW w:type="dxa" w:w="4251"/>
+            <w:tcW w:type="dxa" w:w="2110"/>
             <w:shd w:fill="EDEDED" w:val="clear"/>
             <w:tcMar>
               <w:top w:type="dxa" w:w="60"/>
@@ -31493,7 +31730,7 @@
         </w:tc>
         <w:tc>
           <w:tcPr>
-            <w:tcW w:type="dxa" w:w="2769"/>
+            <w:tcW w:type="dxa" w:w="4910"/>
             <w:shd w:fill="EDEDED" w:val="clear"/>
             <w:tcMar>
               <w:top w:type="dxa" w:w="60"/>
@@ -31547,7 +31784,7 @@
       <w:tr>
         <w:tc>
           <w:tcPr>
-            <w:tcW w:type="dxa" w:w="4251"/>
+            <w:tcW w:type="dxa" w:w="2110"/>
             <w:tcMar>
               <w:top w:type="dxa" w:w="60"/>
               <w:left w:type="dxa" w:w="100"/>
@@ -31581,26 +31818,26 @@
         </w:tc>
         <w:tc>
           <w:tcPr>
-            <w:tcW w:type="dxa" w:w="2769"/>
-            <w:tcMar>
-              <w:top w:type="dxa" w:w="60"/>
-              <w:left w:type="dxa" w:w="100"/>
-              <w:bottom w:type="dxa" w:w="60"/>
-              <w:right w:type="dxa" w:w="100"/>
-            </w:tcMar>
-          </w:tcPr>
-          <w:p>
-            <w:pPr>
-              <w:spacing w:after="0" w:before="0"/>
-            </w:pPr>
-            <w:r>
-              <w:rPr>
-                <w:b w:val="false"/>
-                <w:bCs w:val="false"/>
-                <w:i w:val="false"/>
-                <w:iCs w:val="false"/>
-              </w:rPr>
-              <w:t xml:space="preserve"/>
+            <w:tcW w:type="dxa" w:w="4910"/>
+            <w:tcMar>
+              <w:top w:type="dxa" w:w="60"/>
+              <w:left w:type="dxa" w:w="100"/>
+              <w:bottom w:type="dxa" w:w="60"/>
+              <w:right w:type="dxa" w:w="100"/>
+            </w:tcMar>
+          </w:tcPr>
+          <w:p>
+            <w:pPr>
+              <w:spacing w:after="0" w:before="0"/>
+            </w:pPr>
+            <w:r>
+              <w:rPr>
+                <w:b w:val="false"/>
+                <w:bCs w:val="false"/>
+                <w:i w:val="false"/>
+                <w:iCs w:val="false"/>
+              </w:rPr>
+              <w:t xml:space="preserve">Complies. The Supplier renovates the designated ground floor area into a secure, production-ready facility for both personalization lines and both mailing lines, to the attached preliminary drawings, delivered under the facility works by a CIRA-registered rehabilitation contractor in weeks 7 to 18. As clarified in the Responses to Queries 04, the design relies on no existing electrical, HVAC, ICT or security infrastructure.</w:t>
             </w:r>
           </w:p>
         </w:tc>
@@ -31625,7 +31862,79 @@
                 <w:i w:val="false"/>
                 <w:iCs w:val="false"/>
               </w:rPr>
-              <w:t xml:space="preserve"/>
+              <w:t xml:space="preserve">Preliminary Project Plan Section </w:t>
+            </w:r>
+            <w:fldSimple w:instr="HYPERLINK &quot;Preliminary-Project-Plan-Information-System-Sub-Plans.docx&quot; \l &quot;sec_2_1&quot;">
+              <w:r>
+                <w:rPr>
+                  <w:rStyle w:val="Hyperlink"/>
+                  <w:b w:val="false"/>
+                  <w:bCs w:val="false"/>
+                  <w:i w:val="false"/>
+                  <w:iCs w:val="false"/>
+                </w:rPr>
+                <w:t xml:space="preserve">2.1</w:t>
+              </w:r>
+            </w:fldSimple>
+            <w:r>
+              <w:rPr>
+                <w:b w:val="false"/>
+                <w:bCs w:val="false"/>
+                <w:i w:val="false"/>
+                <w:iCs w:val="false"/>
+              </w:rPr>
+              <w:t xml:space="preserve">; </w:t>
+            </w:r>
+            <w:r>
+              <w:rPr>
+                <w:b w:val="false"/>
+                <w:bCs w:val="false"/>
+                <w:i w:val="false"/>
+                <w:iCs w:val="false"/>
+              </w:rPr>
+              <w:t xml:space="preserve">System Architecture Sections </w:t>
+            </w:r>
+            <w:fldSimple w:instr="HYPERLINK &quot;Document-5-Technical-Proposal-System-Architecture.docx&quot; \l &quot;sec_9_5&quot;">
+              <w:r>
+                <w:rPr>
+                  <w:rStyle w:val="Hyperlink"/>
+                  <w:b w:val="false"/>
+                  <w:bCs w:val="false"/>
+                  <w:i w:val="false"/>
+                  <w:iCs w:val="false"/>
+                </w:rPr>
+                <w:t xml:space="preserve">9.5</w:t>
+              </w:r>
+            </w:fldSimple>
+            <w:r>
+              <w:rPr>
+                <w:b w:val="false"/>
+                <w:bCs w:val="false"/>
+                <w:i w:val="false"/>
+                <w:iCs w:val="false"/>
+              </w:rPr>
+              <w:t xml:space="preserve"> and </w:t>
+            </w:r>
+            <w:fldSimple w:instr="HYPERLINK &quot;Document-5-Technical-Proposal-System-Architecture.docx&quot; \l &quot;sec_13_1&quot;">
+              <w:r>
+                <w:rPr>
+                  <w:rStyle w:val="Hyperlink"/>
+                  <w:b w:val="false"/>
+                  <w:bCs w:val="false"/>
+                  <w:i w:val="false"/>
+                  <w:iCs w:val="false"/>
+                </w:rPr>
+                <w:t xml:space="preserve">13.1</w:t>
+              </w:r>
+            </w:fldSimple>
+            <w:r>
+              <w:rPr>
+                <w:b w:val="false"/>
+                <w:bCs w:val="false"/>
+                <w:i w:val="false"/>
+                <w:iCs w:val="false"/>
+              </w:rPr>
+              <w:t xml:space="preserve">; Attachment: CIRA registration certificate; Attachment: Facility works preliminary drawings</w:t>
             </w:r>
           </w:p>
         </w:tc>
@@ -31633,7 +31942,7 @@
       <w:tr>
         <w:tc>
           <w:tcPr>
-            <w:tcW w:type="dxa" w:w="4251"/>
+            <w:tcW w:type="dxa" w:w="2110"/>
             <w:tcMar>
               <w:top w:type="dxa" w:w="60"/>
               <w:left w:type="dxa" w:w="100"/>
@@ -31667,26 +31976,26 @@
         </w:tc>
         <w:tc>
           <w:tcPr>
-            <w:tcW w:type="dxa" w:w="2769"/>
-            <w:tcMar>
-              <w:top w:type="dxa" w:w="60"/>
-              <w:left w:type="dxa" w:w="100"/>
-              <w:bottom w:type="dxa" w:w="60"/>
-              <w:right w:type="dxa" w:w="100"/>
-            </w:tcMar>
-          </w:tcPr>
-          <w:p>
-            <w:pPr>
-              <w:spacing w:after="0" w:before="0"/>
-            </w:pPr>
-            <w:r>
-              <w:rPr>
-                <w:b w:val="false"/>
-                <w:bCs w:val="false"/>
-                <w:i w:val="false"/>
-                <w:iCs w:val="false"/>
-              </w:rPr>
-              <w:t xml:space="preserve"/>
+            <w:tcW w:type="dxa" w:w="4910"/>
+            <w:tcMar>
+              <w:top w:type="dxa" w:w="60"/>
+              <w:left w:type="dxa" w:w="100"/>
+              <w:bottom w:type="dxa" w:w="60"/>
+              <w:right w:type="dxa" w:w="100"/>
+            </w:tcMar>
+          </w:tcPr>
+          <w:p>
+            <w:pPr>
+              <w:spacing w:after="0" w:before="0"/>
+            </w:pPr>
+            <w:r>
+              <w:rPr>
+                <w:b w:val="false"/>
+                <w:bCs w:val="false"/>
+                <w:i w:val="false"/>
+                <w:iCs w:val="false"/>
+              </w:rPr>
+              <w:t xml:space="preserve">Complies. The facility works cover renovation, refurbishment, fit-out, supply, installation, testing, commissioning and handover of the facility systems, quantified in the attached bill of quantities and scheduled as phase 4 of the implementation plan. They are coordinated with the Information System through the ICT Site Preparation Guide, a readiness inspection in week 18 and building-level checks in pre-commissioning.</w:t>
             </w:r>
           </w:p>
         </w:tc>
@@ -31711,7 +32020,91 @@
                 <w:i w:val="false"/>
                 <w:iCs w:val="false"/>
               </w:rPr>
-              <w:t xml:space="preserve"/>
+              <w:t xml:space="preserve">Preliminary Project Plan Sections </w:t>
+            </w:r>
+            <w:fldSimple w:instr="HYPERLINK &quot;Preliminary-Project-Plan-Information-System-Sub-Plans.docx&quot; \l &quot;sec_2_1&quot;">
+              <w:r>
+                <w:rPr>
+                  <w:rStyle w:val="Hyperlink"/>
+                  <w:b w:val="false"/>
+                  <w:bCs w:val="false"/>
+                  <w:i w:val="false"/>
+                  <w:iCs w:val="false"/>
+                </w:rPr>
+                <w:t xml:space="preserve">2.1</w:t>
+              </w:r>
+            </w:fldSimple>
+            <w:r>
+              <w:rPr>
+                <w:b w:val="false"/>
+                <w:bCs w:val="false"/>
+                <w:i w:val="false"/>
+                <w:iCs w:val="false"/>
+              </w:rPr>
+              <w:t xml:space="preserve">, </w:t>
+            </w:r>
+            <w:fldSimple w:instr="HYPERLINK &quot;Preliminary-Project-Plan-Information-System-Sub-Plans.docx&quot; \l &quot;sec_2_4&quot;">
+              <w:r>
+                <w:rPr>
+                  <w:rStyle w:val="Hyperlink"/>
+                  <w:b w:val="false"/>
+                  <w:bCs w:val="false"/>
+                  <w:i w:val="false"/>
+                  <w:iCs w:val="false"/>
+                </w:rPr>
+                <w:t xml:space="preserve">2.4</w:t>
+              </w:r>
+            </w:fldSimple>
+            <w:r>
+              <w:rPr>
+                <w:b w:val="false"/>
+                <w:bCs w:val="false"/>
+                <w:i w:val="false"/>
+                <w:iCs w:val="false"/>
+              </w:rPr>
+              <w:t xml:space="preserve">, </w:t>
+            </w:r>
+            <w:fldSimple w:instr="HYPERLINK &quot;Preliminary-Project-Plan-Information-System-Sub-Plans.docx&quot; \l &quot;sec_2_9&quot;">
+              <w:r>
+                <w:rPr>
+                  <w:rStyle w:val="Hyperlink"/>
+                  <w:b w:val="false"/>
+                  <w:bCs w:val="false"/>
+                  <w:i w:val="false"/>
+                  <w:iCs w:val="false"/>
+                </w:rPr>
+                <w:t xml:space="preserve">2.9</w:t>
+              </w:r>
+            </w:fldSimple>
+            <w:r>
+              <w:rPr>
+                <w:b w:val="false"/>
+                <w:bCs w:val="false"/>
+                <w:i w:val="false"/>
+                <w:iCs w:val="false"/>
+              </w:rPr>
+              <w:t xml:space="preserve"> and </w:t>
+            </w:r>
+            <w:fldSimple w:instr="HYPERLINK &quot;Preliminary-Project-Plan-Information-System-Sub-Plans.docx&quot; \l &quot;sec_4_5&quot;">
+              <w:r>
+                <w:rPr>
+                  <w:rStyle w:val="Hyperlink"/>
+                  <w:b w:val="false"/>
+                  <w:bCs w:val="false"/>
+                  <w:i w:val="false"/>
+                  <w:iCs w:val="false"/>
+                </w:rPr>
+                <w:t xml:space="preserve">4.5</w:t>
+              </w:r>
+            </w:fldSimple>
+            <w:r>
+              <w:rPr>
+                <w:b w:val="false"/>
+                <w:bCs w:val="false"/>
+                <w:i w:val="false"/>
+                <w:iCs w:val="false"/>
+              </w:rPr>
+              <w:t xml:space="preserve">; Attachment: Facility works bill of quantities</w:t>
             </w:r>
           </w:p>
         </w:tc>
@@ -31719,7 +32112,7 @@
       <w:tr>
         <w:tc>
           <w:tcPr>
-            <w:tcW w:type="dxa" w:w="4251"/>
+            <w:tcW w:type="dxa" w:w="2110"/>
             <w:tcMar>
               <w:top w:type="dxa" w:w="60"/>
               <w:left w:type="dxa" w:w="100"/>
@@ -31753,26 +32146,26 @@
         </w:tc>
         <w:tc>
           <w:tcPr>
-            <w:tcW w:type="dxa" w:w="2769"/>
-            <w:tcMar>
-              <w:top w:type="dxa" w:w="60"/>
-              <w:left w:type="dxa" w:w="100"/>
-              <w:bottom w:type="dxa" w:w="60"/>
-              <w:right w:type="dxa" w:w="100"/>
-            </w:tcMar>
-          </w:tcPr>
-          <w:p>
-            <w:pPr>
-              <w:spacing w:after="0" w:before="0"/>
-            </w:pPr>
-            <w:r>
-              <w:rPr>
-                <w:b w:val="false"/>
-                <w:bCs w:val="false"/>
-                <w:i w:val="false"/>
-                <w:iCs w:val="false"/>
-              </w:rPr>
-              <w:t xml:space="preserve"/>
+            <w:tcW w:type="dxa" w:w="4910"/>
+            <w:tcMar>
+              <w:top w:type="dxa" w:w="60"/>
+              <w:left w:type="dxa" w:w="100"/>
+              <w:bottom w:type="dxa" w:w="60"/>
+              <w:right w:type="dxa" w:w="100"/>
+            </w:tcMar>
+          </w:tcPr>
+          <w:p>
+            <w:pPr>
+              <w:spacing w:after="0" w:before="0"/>
+            </w:pPr>
+            <w:r>
+              <w:rPr>
+                <w:b w:val="false"/>
+                <w:bCs w:val="false"/>
+                <w:i w:val="false"/>
+                <w:iCs w:val="false"/>
+              </w:rPr>
+              <w:t xml:space="preserve">Complies. A reconnaissance of the premises was carried out during proposal preparation, and the preliminary drawings are attached. After award, the detailed site survey verifies dimensions, existing infrastructure, structural suitability, electrical load capacity and environmental conditions and identifies the renovation requirements, leading to the implementation drawings and designs, with the ICT Site Preparation Guide setting loads, power, heat and clearances. As clarified in the Responses to Queries 003, NRB coordinates Buildings Department approval of the structural and electrical designs.</w:t>
             </w:r>
           </w:p>
         </w:tc>
@@ -31797,7 +32190,79 @@
                 <w:i w:val="false"/>
                 <w:iCs w:val="false"/>
               </w:rPr>
-              <w:t xml:space="preserve"/>
+              <w:t xml:space="preserve">Preliminary Project Plan Sections </w:t>
+            </w:r>
+            <w:fldSimple w:instr="HYPERLINK &quot;Preliminary-Project-Plan-Information-System-Sub-Plans.docx&quot; \l &quot;sec_2_3&quot;">
+              <w:r>
+                <w:rPr>
+                  <w:rStyle w:val="Hyperlink"/>
+                  <w:b w:val="false"/>
+                  <w:bCs w:val="false"/>
+                  <w:i w:val="false"/>
+                  <w:iCs w:val="false"/>
+                </w:rPr>
+                <w:t xml:space="preserve">2.3</w:t>
+              </w:r>
+            </w:fldSimple>
+            <w:r>
+              <w:rPr>
+                <w:b w:val="false"/>
+                <w:bCs w:val="false"/>
+                <w:i w:val="false"/>
+                <w:iCs w:val="false"/>
+              </w:rPr>
+              <w:t xml:space="preserve"> and </w:t>
+            </w:r>
+            <w:fldSimple w:instr="HYPERLINK &quot;Preliminary-Project-Plan-Information-System-Sub-Plans.docx&quot; \l &quot;sec_2_4&quot;">
+              <w:r>
+                <w:rPr>
+                  <w:rStyle w:val="Hyperlink"/>
+                  <w:b w:val="false"/>
+                  <w:bCs w:val="false"/>
+                  <w:i w:val="false"/>
+                  <w:iCs w:val="false"/>
+                </w:rPr>
+                <w:t xml:space="preserve">2.4</w:t>
+              </w:r>
+            </w:fldSimple>
+            <w:r>
+              <w:rPr>
+                <w:b w:val="false"/>
+                <w:bCs w:val="false"/>
+                <w:i w:val="false"/>
+                <w:iCs w:val="false"/>
+              </w:rPr>
+              <w:t xml:space="preserve">; </w:t>
+            </w:r>
+            <w:r>
+              <w:rPr>
+                <w:b w:val="false"/>
+                <w:bCs w:val="false"/>
+                <w:i w:val="false"/>
+                <w:iCs w:val="false"/>
+              </w:rPr>
+              <w:t xml:space="preserve">System Architecture Section </w:t>
+            </w:r>
+            <w:fldSimple w:instr="HYPERLINK &quot;Document-5-Technical-Proposal-System-Architecture.docx&quot; \l &quot;sec_13_1&quot;">
+              <w:r>
+                <w:rPr>
+                  <w:rStyle w:val="Hyperlink"/>
+                  <w:b w:val="false"/>
+                  <w:bCs w:val="false"/>
+                  <w:i w:val="false"/>
+                  <w:iCs w:val="false"/>
+                </w:rPr>
+                <w:t xml:space="preserve">13.1</w:t>
+              </w:r>
+            </w:fldSimple>
+            <w:r>
+              <w:rPr>
+                <w:b w:val="false"/>
+                <w:bCs w:val="false"/>
+                <w:i w:val="false"/>
+                <w:iCs w:val="false"/>
+              </w:rPr>
+              <w:t xml:space="preserve">; Attachment: Facility works preliminary drawings</w:t>
             </w:r>
           </w:p>
         </w:tc>
@@ -31805,7 +32270,7 @@
       <w:tr>
         <w:tc>
           <w:tcPr>
-            <w:tcW w:type="dxa" w:w="4251"/>
+            <w:tcW w:type="dxa" w:w="2110"/>
             <w:tcMar>
               <w:top w:type="dxa" w:w="60"/>
               <w:left w:type="dxa" w:w="100"/>
@@ -31839,26 +32304,26 @@
         </w:tc>
         <w:tc>
           <w:tcPr>
-            <w:tcW w:type="dxa" w:w="2769"/>
-            <w:tcMar>
-              <w:top w:type="dxa" w:w="60"/>
-              <w:left w:type="dxa" w:w="100"/>
-              <w:bottom w:type="dxa" w:w="60"/>
-              <w:right w:type="dxa" w:w="100"/>
-            </w:tcMar>
-          </w:tcPr>
-          <w:p>
-            <w:pPr>
-              <w:spacing w:after="0" w:before="0"/>
-            </w:pPr>
-            <w:r>
-              <w:rPr>
-                <w:b w:val="false"/>
-                <w:bCs w:val="false"/>
-                <w:i w:val="false"/>
-                <w:iCs w:val="false"/>
-              </w:rPr>
-              <w:t xml:space="preserve"/>
+            <w:tcW w:type="dxa" w:w="4910"/>
+            <w:tcMar>
+              <w:top w:type="dxa" w:w="60"/>
+              <w:left w:type="dxa" w:w="100"/>
+              <w:bottom w:type="dxa" w:w="60"/>
+              <w:right w:type="dxa" w:w="100"/>
+            </w:tcMar>
+          </w:tcPr>
+          <w:p>
+            <w:pPr>
+              <w:spacing w:after="0" w:before="0"/>
+            </w:pPr>
+            <w:r>
+              <w:rPr>
+                <w:b w:val="false"/>
+                <w:bCs w:val="false"/>
+                <w:i w:val="false"/>
+                <w:iCs w:val="false"/>
+              </w:rPr>
+              <w:t xml:space="preserve">Complies. The facility works carry out partitioning, wall finishing and painting, soundproofing, ceiling and floor finishing, anti-static and raised flooring where required, door installation and replacement, and window reinforcement, to the approved room layout and as quantified in the attached bill of quantities. Raised floor records are delivered with the facility documentation.</w:t>
             </w:r>
           </w:p>
         </w:tc>
@@ -31883,7 +32348,49 @@
                 <w:i w:val="false"/>
                 <w:iCs w:val="false"/>
               </w:rPr>
-              <w:t xml:space="preserve"/>
+              <w:t xml:space="preserve">Preliminary Project Plan Sections </w:t>
+            </w:r>
+            <w:fldSimple w:instr="HYPERLINK &quot;Preliminary-Project-Plan-Information-System-Sub-Plans.docx&quot; \l &quot;sec_2_1&quot;">
+              <w:r>
+                <w:rPr>
+                  <w:rStyle w:val="Hyperlink"/>
+                  <w:b w:val="false"/>
+                  <w:bCs w:val="false"/>
+                  <w:i w:val="false"/>
+                  <w:iCs w:val="false"/>
+                </w:rPr>
+                <w:t xml:space="preserve">2.1</w:t>
+              </w:r>
+            </w:fldSimple>
+            <w:r>
+              <w:rPr>
+                <w:b w:val="false"/>
+                <w:bCs w:val="false"/>
+                <w:i w:val="false"/>
+                <w:iCs w:val="false"/>
+              </w:rPr>
+              <w:t xml:space="preserve"> and </w:t>
+            </w:r>
+            <w:fldSimple w:instr="HYPERLINK &quot;Preliminary-Project-Plan-Information-System-Sub-Plans.docx&quot; \l &quot;sec_2_10&quot;">
+              <w:r>
+                <w:rPr>
+                  <w:rStyle w:val="Hyperlink"/>
+                  <w:b w:val="false"/>
+                  <w:bCs w:val="false"/>
+                  <w:i w:val="false"/>
+                  <w:iCs w:val="false"/>
+                </w:rPr>
+                <w:t xml:space="preserve">2.10</w:t>
+              </w:r>
+            </w:fldSimple>
+            <w:r>
+              <w:rPr>
+                <w:b w:val="false"/>
+                <w:bCs w:val="false"/>
+                <w:i w:val="false"/>
+                <w:iCs w:val="false"/>
+              </w:rPr>
+              <w:t xml:space="preserve">; Attachment: Facility works preliminary drawings; Attachment: Facility works bill of quantities</w:t>
             </w:r>
           </w:p>
         </w:tc>
@@ -31891,7 +32398,7 @@
       <w:tr>
         <w:tc>
           <w:tcPr>
-            <w:tcW w:type="dxa" w:w="4251"/>
+            <w:tcW w:type="dxa" w:w="2110"/>
             <w:tcMar>
               <w:top w:type="dxa" w:w="60"/>
               <w:left w:type="dxa" w:w="100"/>
@@ -31925,26 +32432,26 @@
         </w:tc>
         <w:tc>
           <w:tcPr>
-            <w:tcW w:type="dxa" w:w="2769"/>
-            <w:tcMar>
-              <w:top w:type="dxa" w:w="60"/>
-              <w:left w:type="dxa" w:w="100"/>
-              <w:bottom w:type="dxa" w:w="60"/>
-              <w:right w:type="dxa" w:w="100"/>
-            </w:tcMar>
-          </w:tcPr>
-          <w:p>
-            <w:pPr>
-              <w:spacing w:after="0" w:before="0"/>
-            </w:pPr>
-            <w:r>
-              <w:rPr>
-                <w:b w:val="false"/>
-                <w:bCs w:val="false"/>
-                <w:i w:val="false"/>
-                <w:iCs w:val="false"/>
-              </w:rPr>
-              <w:t xml:space="preserve"/>
+            <w:tcW w:type="dxa" w:w="4910"/>
+            <w:tcMar>
+              <w:top w:type="dxa" w:w="60"/>
+              <w:left w:type="dxa" w:w="100"/>
+              <w:bottom w:type="dxa" w:w="60"/>
+              <w:right w:type="dxa" w:w="100"/>
+            </w:tcMar>
+          </w:tcPr>
+          <w:p>
+            <w:pPr>
+              <w:spacing w:after="0" w:before="0"/>
+            </w:pPr>
+            <w:r>
+              <w:rPr>
+                <w:b w:val="false"/>
+                <w:bCs w:val="false"/>
+                <w:i w:val="false"/>
+                <w:iCs w:val="false"/>
+              </w:rPr>
+              <w:t xml:space="preserve">Complies. The attached preliminary drawings provide every listed area: separated secure areas for card personalization, blank card storage sized for all 2,000,000 cards, consumables storage, quality assurance, secure destruction, packaging and mailing, the server room, the control room and operator workspaces, so that stock reconciliation rests on physically controlled custody.</w:t>
             </w:r>
           </w:p>
         </w:tc>
@@ -31969,7 +32476,100 @@
                 <w:i w:val="false"/>
                 <w:iCs w:val="false"/>
               </w:rPr>
-              <w:t xml:space="preserve"/>
+              <w:t xml:space="preserve">System Architecture Sections </w:t>
+            </w:r>
+            <w:fldSimple w:instr="HYPERLINK &quot;Document-5-Technical-Proposal-System-Architecture.docx&quot; \l &quot;sec_6_10&quot;">
+              <w:r>
+                <w:rPr>
+                  <w:rStyle w:val="Hyperlink"/>
+                  <w:b w:val="false"/>
+                  <w:bCs w:val="false"/>
+                  <w:i w:val="false"/>
+                  <w:iCs w:val="false"/>
+                </w:rPr>
+                <w:t xml:space="preserve">6.10</w:t>
+              </w:r>
+            </w:fldSimple>
+            <w:r>
+              <w:rPr>
+                <w:b w:val="false"/>
+                <w:bCs w:val="false"/>
+                <w:i w:val="false"/>
+                <w:iCs w:val="false"/>
+              </w:rPr>
+              <w:t xml:space="preserve">, </w:t>
+            </w:r>
+            <w:fldSimple w:instr="HYPERLINK &quot;Document-5-Technical-Proposal-System-Architecture.docx&quot; \l &quot;sec_9_5&quot;">
+              <w:r>
+                <w:rPr>
+                  <w:rStyle w:val="Hyperlink"/>
+                  <w:b w:val="false"/>
+                  <w:bCs w:val="false"/>
+                  <w:i w:val="false"/>
+                  <w:iCs w:val="false"/>
+                </w:rPr>
+                <w:t xml:space="preserve">9.5</w:t>
+              </w:r>
+            </w:fldSimple>
+            <w:r>
+              <w:rPr>
+                <w:b w:val="false"/>
+                <w:bCs w:val="false"/>
+                <w:i w:val="false"/>
+                <w:iCs w:val="false"/>
+              </w:rPr>
+              <w:t xml:space="preserve"> and </w:t>
+            </w:r>
+            <w:fldSimple w:instr="HYPERLINK &quot;Document-5-Technical-Proposal-System-Architecture.docx&quot; \l &quot;sec_10_7&quot;">
+              <w:r>
+                <w:rPr>
+                  <w:rStyle w:val="Hyperlink"/>
+                  <w:b w:val="false"/>
+                  <w:bCs w:val="false"/>
+                  <w:i w:val="false"/>
+                  <w:iCs w:val="false"/>
+                </w:rPr>
+                <w:t xml:space="preserve">10.7</w:t>
+              </w:r>
+            </w:fldSimple>
+            <w:r>
+              <w:rPr>
+                <w:b w:val="false"/>
+                <w:bCs w:val="false"/>
+                <w:i w:val="false"/>
+                <w:iCs w:val="false"/>
+              </w:rPr>
+              <w:t xml:space="preserve">; </w:t>
+            </w:r>
+            <w:r>
+              <w:rPr>
+                <w:b w:val="false"/>
+                <w:bCs w:val="false"/>
+                <w:i w:val="false"/>
+                <w:iCs w:val="false"/>
+              </w:rPr>
+              <w:t xml:space="preserve">Preliminary Project Plan Section </w:t>
+            </w:r>
+            <w:fldSimple w:instr="HYPERLINK &quot;Preliminary-Project-Plan-Information-System-Sub-Plans.docx&quot; \l &quot;sec_2_7&quot;">
+              <w:r>
+                <w:rPr>
+                  <w:rStyle w:val="Hyperlink"/>
+                  <w:b w:val="false"/>
+                  <w:bCs w:val="false"/>
+                  <w:i w:val="false"/>
+                  <w:iCs w:val="false"/>
+                </w:rPr>
+                <w:t xml:space="preserve">2.7</w:t>
+              </w:r>
+            </w:fldSimple>
+            <w:r>
+              <w:rPr>
+                <w:b w:val="false"/>
+                <w:bCs w:val="false"/>
+                <w:i w:val="false"/>
+                <w:iCs w:val="false"/>
+              </w:rPr>
+              <w:t xml:space="preserve">; Attachment: Facility works preliminary drawings</w:t>
             </w:r>
           </w:p>
         </w:tc>
@@ -31977,7 +32577,7 @@
       <w:tr>
         <w:tc>
           <w:tcPr>
-            <w:tcW w:type="dxa" w:w="4251"/>
+            <w:tcW w:type="dxa" w:w="2110"/>
             <w:tcMar>
               <w:top w:type="dxa" w:w="60"/>
               <w:left w:type="dxa" w:w="100"/>
@@ -32011,26 +32611,26 @@
         </w:tc>
         <w:tc>
           <w:tcPr>
-            <w:tcW w:type="dxa" w:w="2769"/>
-            <w:tcMar>
-              <w:top w:type="dxa" w:w="60"/>
-              <w:left w:type="dxa" w:w="100"/>
-              <w:bottom w:type="dxa" w:w="60"/>
-              <w:right w:type="dxa" w:w="100"/>
-            </w:tcMar>
-          </w:tcPr>
-          <w:p>
-            <w:pPr>
-              <w:spacing w:after="0" w:before="0"/>
-            </w:pPr>
-            <w:r>
-              <w:rPr>
-                <w:b w:val="false"/>
-                <w:bCs w:val="false"/>
-                <w:i w:val="false"/>
-                <w:iCs w:val="false"/>
-              </w:rPr>
-              <w:t xml:space="preserve"/>
+            <w:tcW w:type="dxa" w:w="4910"/>
+            <w:tcMar>
+              <w:top w:type="dxa" w:w="60"/>
+              <w:left w:type="dxa" w:w="100"/>
+              <w:bottom w:type="dxa" w:w="60"/>
+              <w:right w:type="dxa" w:w="100"/>
+            </w:tcMar>
+          </w:tcPr>
+          <w:p>
+            <w:pPr>
+              <w:spacing w:after="0" w:before="0"/>
+            </w:pPr>
+            <w:r>
+              <w:rPr>
+                <w:b w:val="false"/>
+                <w:bCs w:val="false"/>
+                <w:i w:val="false"/>
+                <w:iCs w:val="false"/>
+              </w:rPr>
+              <w:t xml:space="preserve">Complies. The facility works install burglar-proofing, reinforced doors under biometric access control, secure locks, lockable security cages and secure storage installations for the blank card store and the destruction area, and an anti-bandit door to the server room. Every opening is logged and correlated with system activity.</w:t>
             </w:r>
           </w:p>
         </w:tc>
@@ -32055,7 +32655,79 @@
                 <w:i w:val="false"/>
                 <w:iCs w:val="false"/>
               </w:rPr>
-              <w:t xml:space="preserve"/>
+              <w:t xml:space="preserve">System Architecture Section </w:t>
+            </w:r>
+            <w:fldSimple w:instr="HYPERLINK &quot;Document-5-Technical-Proposal-System-Architecture.docx&quot; \l &quot;sec_9_5&quot;">
+              <w:r>
+                <w:rPr>
+                  <w:rStyle w:val="Hyperlink"/>
+                  <w:b w:val="false"/>
+                  <w:bCs w:val="false"/>
+                  <w:i w:val="false"/>
+                  <w:iCs w:val="false"/>
+                </w:rPr>
+                <w:t xml:space="preserve">9.5</w:t>
+              </w:r>
+            </w:fldSimple>
+            <w:r>
+              <w:rPr>
+                <w:b w:val="false"/>
+                <w:bCs w:val="false"/>
+                <w:i w:val="false"/>
+                <w:iCs w:val="false"/>
+              </w:rPr>
+              <w:t xml:space="preserve">; </w:t>
+            </w:r>
+            <w:r>
+              <w:rPr>
+                <w:b w:val="false"/>
+                <w:bCs w:val="false"/>
+                <w:i w:val="false"/>
+                <w:iCs w:val="false"/>
+              </w:rPr>
+              <w:t xml:space="preserve">Cybersecurity Risk Management Plan Sections </w:t>
+            </w:r>
+            <w:fldSimple w:instr="HYPERLINK &quot;Cybersecurity-Risk-Management-Plan.docx&quot; \l &quot;sec_5_2&quot;">
+              <w:r>
+                <w:rPr>
+                  <w:rStyle w:val="Hyperlink"/>
+                  <w:b w:val="false"/>
+                  <w:bCs w:val="false"/>
+                  <w:i w:val="false"/>
+                  <w:iCs w:val="false"/>
+                </w:rPr>
+                <w:t xml:space="preserve">5.2</w:t>
+              </w:r>
+            </w:fldSimple>
+            <w:r>
+              <w:rPr>
+                <w:b w:val="false"/>
+                <w:bCs w:val="false"/>
+                <w:i w:val="false"/>
+                <w:iCs w:val="false"/>
+              </w:rPr>
+              <w:t xml:space="preserve"> and </w:t>
+            </w:r>
+            <w:fldSimple w:instr="HYPERLINK &quot;Cybersecurity-Risk-Management-Plan.docx&quot; \l &quot;sec_10&quot;">
+              <w:r>
+                <w:rPr>
+                  <w:rStyle w:val="Hyperlink"/>
+                  <w:b w:val="false"/>
+                  <w:bCs w:val="false"/>
+                  <w:i w:val="false"/>
+                  <w:iCs w:val="false"/>
+                </w:rPr>
+                <w:t xml:space="preserve">10</w:t>
+              </w:r>
+            </w:fldSimple>
+            <w:r>
+              <w:rPr>
+                <w:b w:val="false"/>
+                <w:bCs w:val="false"/>
+                <w:i w:val="false"/>
+                <w:iCs w:val="false"/>
+              </w:rPr>
+              <w:t xml:space="preserve">; Attachment: Facility works preliminary drawings; Attachment: Facility works bill of quantities</w:t>
             </w:r>
           </w:p>
         </w:tc>
@@ -32063,7 +32735,7 @@
       <w:tr>
         <w:tc>
           <w:tcPr>
-            <w:tcW w:type="dxa" w:w="4251"/>
+            <w:tcW w:type="dxa" w:w="2110"/>
             <w:tcMar>
               <w:top w:type="dxa" w:w="60"/>
               <w:left w:type="dxa" w:w="100"/>
@@ -32097,26 +32769,26 @@
         </w:tc>
         <w:tc>
           <w:tcPr>
-            <w:tcW w:type="dxa" w:w="2769"/>
-            <w:tcMar>
-              <w:top w:type="dxa" w:w="60"/>
-              <w:left w:type="dxa" w:w="100"/>
-              <w:bottom w:type="dxa" w:w="60"/>
-              <w:right w:type="dxa" w:w="100"/>
-            </w:tcMar>
-          </w:tcPr>
-          <w:p>
-            <w:pPr>
-              <w:spacing w:after="0" w:before="0"/>
-            </w:pPr>
-            <w:r>
-              <w:rPr>
-                <w:b w:val="false"/>
-                <w:bCs w:val="false"/>
-                <w:i w:val="false"/>
-                <w:iCs w:val="false"/>
-              </w:rPr>
-              <w:t xml:space="preserve"/>
+            <w:tcW w:type="dxa" w:w="4910"/>
+            <w:tcMar>
+              <w:top w:type="dxa" w:w="60"/>
+              <w:left w:type="dxa" w:w="100"/>
+              <w:bottom w:type="dxa" w:w="60"/>
+              <w:right w:type="dxa" w:w="100"/>
+            </w:tcMar>
+          </w:tcPr>
+          <w:p>
+            <w:pPr>
+              <w:spacing w:after="0" w:before="0"/>
+            </w:pPr>
+            <w:r>
+              <w:rPr>
+                <w:b w:val="false"/>
+                <w:bCs w:val="false"/>
+                <w:i w:val="false"/>
+                <w:iCs w:val="false"/>
+              </w:rPr>
+              <w:t xml:space="preserve">Complies. A new electrical installation provides rewiring, dedicated circuits, distribution boards, protection, isolators and breakers, earthing, lightning protection, outlets, cable management and emergency lighting, backed by uninterruptible power supply and a 50 kVA standby generator with automatic transfer. As clarified in the Responses to Queries 04, NRB supplies a separate, dedicated power connection to the approved design.</w:t>
             </w:r>
           </w:p>
         </w:tc>
@@ -32141,7 +32813,79 @@
                 <w:i w:val="false"/>
                 <w:iCs w:val="false"/>
               </w:rPr>
-              <w:t xml:space="preserve"/>
+              <w:t xml:space="preserve">System Architecture Sections </w:t>
+            </w:r>
+            <w:fldSimple w:instr="HYPERLINK &quot;Document-5-Technical-Proposal-System-Architecture.docx&quot; \l &quot;sec_9_5&quot;">
+              <w:r>
+                <w:rPr>
+                  <w:rStyle w:val="Hyperlink"/>
+                  <w:b w:val="false"/>
+                  <w:bCs w:val="false"/>
+                  <w:i w:val="false"/>
+                  <w:iCs w:val="false"/>
+                </w:rPr>
+                <w:t xml:space="preserve">9.5</w:t>
+              </w:r>
+            </w:fldSimple>
+            <w:r>
+              <w:rPr>
+                <w:b w:val="false"/>
+                <w:bCs w:val="false"/>
+                <w:i w:val="false"/>
+                <w:iCs w:val="false"/>
+              </w:rPr>
+              <w:t xml:space="preserve"> and </w:t>
+            </w:r>
+            <w:fldSimple w:instr="HYPERLINK &quot;Document-5-Technical-Proposal-System-Architecture.docx&quot; \l &quot;sec_13_1&quot;">
+              <w:r>
+                <w:rPr>
+                  <w:rStyle w:val="Hyperlink"/>
+                  <w:b w:val="false"/>
+                  <w:bCs w:val="false"/>
+                  <w:i w:val="false"/>
+                  <w:iCs w:val="false"/>
+                </w:rPr>
+                <w:t xml:space="preserve">13.1</w:t>
+              </w:r>
+            </w:fldSimple>
+            <w:r>
+              <w:rPr>
+                <w:b w:val="false"/>
+                <w:bCs w:val="false"/>
+                <w:i w:val="false"/>
+                <w:iCs w:val="false"/>
+              </w:rPr>
+              <w:t xml:space="preserve">; </w:t>
+            </w:r>
+            <w:r>
+              <w:rPr>
+                <w:b w:val="false"/>
+                <w:bCs w:val="false"/>
+                <w:i w:val="false"/>
+                <w:iCs w:val="false"/>
+              </w:rPr>
+              <w:t xml:space="preserve">Preliminary Project Plan Section </w:t>
+            </w:r>
+            <w:fldSimple w:instr="HYPERLINK &quot;Preliminary-Project-Plan-Information-System-Sub-Plans.docx&quot; \l &quot;sec_2_7&quot;">
+              <w:r>
+                <w:rPr>
+                  <w:rStyle w:val="Hyperlink"/>
+                  <w:b w:val="false"/>
+                  <w:bCs w:val="false"/>
+                  <w:i w:val="false"/>
+                  <w:iCs w:val="false"/>
+                </w:rPr>
+                <w:t xml:space="preserve">2.7</w:t>
+              </w:r>
+            </w:fldSimple>
+            <w:r>
+              <w:rPr>
+                <w:b w:val="false"/>
+                <w:bCs w:val="false"/>
+                <w:i w:val="false"/>
+                <w:iCs w:val="false"/>
+              </w:rPr>
+              <w:t xml:space="preserve">; Attachment: Facility works preliminary drawings; Attachment: Facility works bill of quantities</w:t>
             </w:r>
           </w:p>
         </w:tc>
@@ -32149,7 +32893,7 @@
       <w:tr>
         <w:tc>
           <w:tcPr>
-            <w:tcW w:type="dxa" w:w="4251"/>
+            <w:tcW w:type="dxa" w:w="2110"/>
             <w:tcMar>
               <w:top w:type="dxa" w:w="60"/>
               <w:left w:type="dxa" w:w="100"/>
@@ -32183,7 +32927,7 @@
         </w:tc>
         <w:tc>
           <w:tcPr>
-            <w:tcW w:type="dxa" w:w="2769"/>
+            <w:tcW w:type="dxa" w:w="4910"/>
             <w:tcMar>
               <w:top w:type="dxa" w:w="60"/>
               <w:left w:type="dxa" w:w="100"/>
@@ -32289,7 +33033,7 @@
       <w:tr>
         <w:tc>
           <w:tcPr>
-            <w:tcW w:type="dxa" w:w="4251"/>
+            <w:tcW w:type="dxa" w:w="2110"/>
             <w:tcMar>
               <w:top w:type="dxa" w:w="60"/>
               <w:left w:type="dxa" w:w="100"/>
@@ -32323,26 +33067,26 @@
         </w:tc>
         <w:tc>
           <w:tcPr>
-            <w:tcW w:type="dxa" w:w="2769"/>
-            <w:tcMar>
-              <w:top w:type="dxa" w:w="60"/>
-              <w:left w:type="dxa" w:w="100"/>
-              <w:bottom w:type="dxa" w:w="60"/>
-              <w:right w:type="dxa" w:w="100"/>
-            </w:tcMar>
-          </w:tcPr>
-          <w:p>
-            <w:pPr>
-              <w:spacing w:after="0" w:before="0"/>
-            </w:pPr>
-            <w:r>
-              <w:rPr>
-                <w:b w:val="false"/>
-                <w:bCs w:val="false"/>
-                <w:i w:val="false"/>
-                <w:iCs w:val="false"/>
-              </w:rPr>
-              <w:t xml:space="preserve"/>
+            <w:tcW w:type="dxa" w:w="4910"/>
+            <w:tcMar>
+              <w:top w:type="dxa" w:w="60"/>
+              <w:left w:type="dxa" w:w="100"/>
+              <w:bottom w:type="dxa" w:w="60"/>
+              <w:right w:type="dxa" w:w="100"/>
+            </w:tcMar>
+          </w:tcPr>
+          <w:p>
+            <w:pPr>
+              <w:spacing w:after="0" w:before="0"/>
+            </w:pPr>
+            <w:r>
+              <w:rPr>
+                <w:b w:val="false"/>
+                <w:bCs w:val="false"/>
+                <w:i w:val="false"/>
+                <w:iCs w:val="false"/>
+              </w:rPr>
+              <w:t xml:space="preserve">Complies. Structured LAN cabling, fiber where required, network cabinets and racks with rack power distribution, patch panels, cable trays and conduits, network outlets and labeling are installed to the approved room layout and quantified in the attached bill of quantities, with data center rack arrangements in the server room. Cable management and labeling are verified in pre-commissioning.</w:t>
             </w:r>
           </w:p>
         </w:tc>
@@ -32367,7 +33111,79 @@
                 <w:i w:val="false"/>
                 <w:iCs w:val="false"/>
               </w:rPr>
-              <w:t xml:space="preserve"/>
+              <w:t xml:space="preserve">System Architecture Sections </w:t>
+            </w:r>
+            <w:fldSimple w:instr="HYPERLINK &quot;Document-5-Technical-Proposal-System-Architecture.docx&quot; \l &quot;sec_9_4&quot;">
+              <w:r>
+                <w:rPr>
+                  <w:rStyle w:val="Hyperlink"/>
+                  <w:b w:val="false"/>
+                  <w:bCs w:val="false"/>
+                  <w:i w:val="false"/>
+                  <w:iCs w:val="false"/>
+                </w:rPr>
+                <w:t xml:space="preserve">9.4</w:t>
+              </w:r>
+            </w:fldSimple>
+            <w:r>
+              <w:rPr>
+                <w:b w:val="false"/>
+                <w:bCs w:val="false"/>
+                <w:i w:val="false"/>
+                <w:iCs w:val="false"/>
+              </w:rPr>
+              <w:t xml:space="preserve"> and </w:t>
+            </w:r>
+            <w:fldSimple w:instr="HYPERLINK &quot;Document-5-Technical-Proposal-System-Architecture.docx&quot; \l &quot;sec_9_5&quot;">
+              <w:r>
+                <w:rPr>
+                  <w:rStyle w:val="Hyperlink"/>
+                  <w:b w:val="false"/>
+                  <w:bCs w:val="false"/>
+                  <w:i w:val="false"/>
+                  <w:iCs w:val="false"/>
+                </w:rPr>
+                <w:t xml:space="preserve">9.5</w:t>
+              </w:r>
+            </w:fldSimple>
+            <w:r>
+              <w:rPr>
+                <w:b w:val="false"/>
+                <w:bCs w:val="false"/>
+                <w:i w:val="false"/>
+                <w:iCs w:val="false"/>
+              </w:rPr>
+              <w:t xml:space="preserve">; </w:t>
+            </w:r>
+            <w:r>
+              <w:rPr>
+                <w:b w:val="false"/>
+                <w:bCs w:val="false"/>
+                <w:i w:val="false"/>
+                <w:iCs w:val="false"/>
+              </w:rPr>
+              <w:t xml:space="preserve">Preliminary Project Plan Section </w:t>
+            </w:r>
+            <w:fldSimple w:instr="HYPERLINK &quot;Preliminary-Project-Plan-Information-System-Sub-Plans.docx&quot; \l &quot;sec_4_5&quot;">
+              <w:r>
+                <w:rPr>
+                  <w:rStyle w:val="Hyperlink"/>
+                  <w:b w:val="false"/>
+                  <w:bCs w:val="false"/>
+                  <w:i w:val="false"/>
+                  <w:iCs w:val="false"/>
+                </w:rPr>
+                <w:t xml:space="preserve">4.5</w:t>
+              </w:r>
+            </w:fldSimple>
+            <w:r>
+              <w:rPr>
+                <w:b w:val="false"/>
+                <w:bCs w:val="false"/>
+                <w:i w:val="false"/>
+                <w:iCs w:val="false"/>
+              </w:rPr>
+              <w:t xml:space="preserve">; Attachment: Facility works bill of quantities</w:t>
             </w:r>
           </w:p>
         </w:tc>
@@ -32375,7 +33191,7 @@
       <w:tr>
         <w:tc>
           <w:tcPr>
-            <w:tcW w:type="dxa" w:w="4251"/>
+            <w:tcW w:type="dxa" w:w="2110"/>
             <w:tcMar>
               <w:top w:type="dxa" w:w="60"/>
               <w:left w:type="dxa" w:w="100"/>
@@ -32409,7 +33225,7 @@
         </w:tc>
         <w:tc>
           <w:tcPr>
-            <w:tcW w:type="dxa" w:w="2769"/>
+            <w:tcW w:type="dxa" w:w="4910"/>
             <w:tcMar>
               <w:top w:type="dxa" w:w="60"/>
               <w:left w:type="dxa" w:w="100"/>
@@ -32494,7 +33310,7 @@
       <w:tr>
         <w:tc>
           <w:tcPr>
-            <w:tcW w:type="dxa" w:w="4251"/>
+            <w:tcW w:type="dxa" w:w="2110"/>
             <w:tcMar>
               <w:top w:type="dxa" w:w="60"/>
               <w:left w:type="dxa" w:w="100"/>
@@ -32528,26 +33344,26 @@
         </w:tc>
         <w:tc>
           <w:tcPr>
-            <w:tcW w:type="dxa" w:w="2769"/>
-            <w:tcMar>
-              <w:top w:type="dxa" w:w="60"/>
-              <w:left w:type="dxa" w:w="100"/>
-              <w:bottom w:type="dxa" w:w="60"/>
-              <w:right w:type="dxa" w:w="100"/>
-            </w:tcMar>
-          </w:tcPr>
-          <w:p>
-            <w:pPr>
-              <w:spacing w:after="0" w:before="0"/>
-            </w:pPr>
-            <w:r>
-              <w:rPr>
-                <w:b w:val="false"/>
-                <w:bCs w:val="false"/>
-                <w:i w:val="false"/>
-                <w:iCs w:val="false"/>
-              </w:rPr>
-              <w:t xml:space="preserve"/>
+            <w:tcW w:type="dxa" w:w="4910"/>
+            <w:tcMar>
+              <w:top w:type="dxa" w:w="60"/>
+              <w:left w:type="dxa" w:w="100"/>
+              <w:bottom w:type="dxa" w:w="60"/>
+              <w:right w:type="dxa" w:w="100"/>
+            </w:tcMar>
+          </w:tcPr>
+          <w:p>
+            <w:pPr>
+              <w:spacing w:after="0" w:before="0"/>
+            </w:pPr>
+            <w:r>
+              <w:rPr>
+                <w:b w:val="false"/>
+                <w:bCs w:val="false"/>
+                <w:i w:val="false"/>
+                <w:iCs w:val="false"/>
+              </w:rPr>
+              <w:t xml:space="preserve">Complies. A ZKTeco biometric access control system, with smart card credentials, enforces role-based access zones for the server room, production area and secure stores, and every entry, including escorted visitors, is logged. Access events feed security monitoring, so a privileged session opened from a room no authorized person has entered raises an alert.</w:t>
             </w:r>
           </w:p>
         </w:tc>
@@ -32572,7 +33388,79 @@
                 <w:i w:val="false"/>
                 <w:iCs w:val="false"/>
               </w:rPr>
-              <w:t xml:space="preserve"/>
+              <w:t xml:space="preserve">System Architecture Sections </w:t>
+            </w:r>
+            <w:fldSimple w:instr="HYPERLINK &quot;Document-5-Technical-Proposal-System-Architecture.docx&quot; \l &quot;sec_9_5&quot;">
+              <w:r>
+                <w:rPr>
+                  <w:rStyle w:val="Hyperlink"/>
+                  <w:b w:val="false"/>
+                  <w:bCs w:val="false"/>
+                  <w:i w:val="false"/>
+                  <w:iCs w:val="false"/>
+                </w:rPr>
+                <w:t xml:space="preserve">9.5</w:t>
+              </w:r>
+            </w:fldSimple>
+            <w:r>
+              <w:rPr>
+                <w:b w:val="false"/>
+                <w:bCs w:val="false"/>
+                <w:i w:val="false"/>
+                <w:iCs w:val="false"/>
+              </w:rPr>
+              <w:t xml:space="preserve"> and </w:t>
+            </w:r>
+            <w:fldSimple w:instr="HYPERLINK &quot;Document-5-Technical-Proposal-System-Architecture.docx&quot; \l &quot;sec_10_7&quot;">
+              <w:r>
+                <w:rPr>
+                  <w:rStyle w:val="Hyperlink"/>
+                  <w:b w:val="false"/>
+                  <w:bCs w:val="false"/>
+                  <w:i w:val="false"/>
+                  <w:iCs w:val="false"/>
+                </w:rPr>
+                <w:t xml:space="preserve">10.7</w:t>
+              </w:r>
+            </w:fldSimple>
+            <w:r>
+              <w:rPr>
+                <w:b w:val="false"/>
+                <w:bCs w:val="false"/>
+                <w:i w:val="false"/>
+                <w:iCs w:val="false"/>
+              </w:rPr>
+              <w:t xml:space="preserve">; </w:t>
+            </w:r>
+            <w:r>
+              <w:rPr>
+                <w:b w:val="false"/>
+                <w:bCs w:val="false"/>
+                <w:i w:val="false"/>
+                <w:iCs w:val="false"/>
+              </w:rPr>
+              <w:t xml:space="preserve">Cybersecurity Risk Management Plan Section </w:t>
+            </w:r>
+            <w:fldSimple w:instr="HYPERLINK &quot;Cybersecurity-Risk-Management-Plan.docx&quot; \l &quot;sec_10&quot;">
+              <w:r>
+                <w:rPr>
+                  <w:rStyle w:val="Hyperlink"/>
+                  <w:b w:val="false"/>
+                  <w:bCs w:val="false"/>
+                  <w:i w:val="false"/>
+                  <w:iCs w:val="false"/>
+                </w:rPr>
+                <w:t xml:space="preserve">10</w:t>
+              </w:r>
+            </w:fldSimple>
+            <w:r>
+              <w:rPr>
+                <w:b w:val="false"/>
+                <w:bCs w:val="false"/>
+                <w:i w:val="false"/>
+                <w:iCs w:val="false"/>
+              </w:rPr>
+              <w:t xml:space="preserve">; Attachment: Facility works bill of quantities</w:t>
             </w:r>
           </w:p>
         </w:tc>
@@ -32580,7 +33468,7 @@
       <w:tr>
         <w:tc>
           <w:tcPr>
-            <w:tcW w:type="dxa" w:w="4251"/>
+            <w:tcW w:type="dxa" w:w="2110"/>
             <w:tcMar>
               <w:top w:type="dxa" w:w="60"/>
               <w:left w:type="dxa" w:w="100"/>
@@ -32614,26 +33502,26 @@
         </w:tc>
         <w:tc>
           <w:tcPr>
-            <w:tcW w:type="dxa" w:w="2769"/>
-            <w:tcMar>
-              <w:top w:type="dxa" w:w="60"/>
-              <w:left w:type="dxa" w:w="100"/>
-              <w:bottom w:type="dxa" w:w="60"/>
-              <w:right w:type="dxa" w:w="100"/>
-            </w:tcMar>
-          </w:tcPr>
-          <w:p>
-            <w:pPr>
-              <w:spacing w:after="0" w:before="0"/>
-            </w:pPr>
-            <w:r>
-              <w:rPr>
-                <w:b w:val="false"/>
-                <w:bCs w:val="false"/>
-                <w:i w:val="false"/>
-                <w:iCs w:val="false"/>
-              </w:rPr>
-              <w:t xml:space="preserve"/>
+            <w:tcW w:type="dxa" w:w="4910"/>
+            <w:tcMar>
+              <w:top w:type="dxa" w:w="60"/>
+              <w:left w:type="dxa" w:w="100"/>
+              <w:bottom w:type="dxa" w:w="60"/>
+              <w:right w:type="dxa" w:w="100"/>
+            </w:tcMar>
+          </w:tcPr>
+          <w:p>
+            <w:pPr>
+              <w:spacing w:after="0" w:before="0"/>
+            </w:pPr>
+            <w:r>
+              <w:rPr>
+                <w:b w:val="false"/>
+                <w:bCs w:val="false"/>
+                <w:i w:val="false"/>
+                <w:iCs w:val="false"/>
+              </w:rPr>
+              <w:t xml:space="preserve">Complies. A Hikvision closed circuit television system, with internal and external cameras covering the production area, secure stores, server room and perimeter, records to a video recording system with centralized monitoring and long-term storage under a defined retention period.</w:t>
             </w:r>
           </w:p>
         </w:tc>
@@ -32658,7 +33546,28 @@
                 <w:i w:val="false"/>
                 <w:iCs w:val="false"/>
               </w:rPr>
-              <w:t xml:space="preserve"/>
+              <w:t xml:space="preserve">System Architecture Section </w:t>
+            </w:r>
+            <w:fldSimple w:instr="HYPERLINK &quot;Document-5-Technical-Proposal-System-Architecture.docx&quot; \l &quot;sec_9_5&quot;">
+              <w:r>
+                <w:rPr>
+                  <w:rStyle w:val="Hyperlink"/>
+                  <w:b w:val="false"/>
+                  <w:bCs w:val="false"/>
+                  <w:i w:val="false"/>
+                  <w:iCs w:val="false"/>
+                </w:rPr>
+                <w:t xml:space="preserve">9.5</w:t>
+              </w:r>
+            </w:fldSimple>
+            <w:r>
+              <w:rPr>
+                <w:b w:val="false"/>
+                <w:bCs w:val="false"/>
+                <w:i w:val="false"/>
+                <w:iCs w:val="false"/>
+              </w:rPr>
+              <w:t xml:space="preserve">; Attachment: Facility works bill of quantities</w:t>
             </w:r>
           </w:p>
         </w:tc>
@@ -32666,7 +33575,7 @@
       <w:tr>
         <w:tc>
           <w:tcPr>
-            <w:tcW w:type="dxa" w:w="4251"/>
+            <w:tcW w:type="dxa" w:w="2110"/>
             <w:tcMar>
               <w:top w:type="dxa" w:w="60"/>
               <w:left w:type="dxa" w:w="100"/>
@@ -32700,26 +33609,26 @@
         </w:tc>
         <w:tc>
           <w:tcPr>
-            <w:tcW w:type="dxa" w:w="2769"/>
-            <w:tcMar>
-              <w:top w:type="dxa" w:w="60"/>
-              <w:left w:type="dxa" w:w="100"/>
-              <w:bottom w:type="dxa" w:w="60"/>
-              <w:right w:type="dxa" w:w="100"/>
-            </w:tcMar>
-          </w:tcPr>
-          <w:p>
-            <w:pPr>
-              <w:spacing w:after="0" w:before="0"/>
-            </w:pPr>
-            <w:r>
-              <w:rPr>
-                <w:b w:val="false"/>
-                <w:bCs w:val="false"/>
-                <w:i w:val="false"/>
-                <w:iCs w:val="false"/>
-              </w:rPr>
-              <w:t xml:space="preserve"/>
+            <w:tcW w:type="dxa" w:w="4910"/>
+            <w:tcMar>
+              <w:top w:type="dxa" w:w="60"/>
+              <w:left w:type="dxa" w:w="100"/>
+              <w:bottom w:type="dxa" w:w="60"/>
+              <w:right w:type="dxa" w:w="100"/>
+            </w:tcMar>
+          </w:tcPr>
+          <w:p>
+            <w:pPr>
+              <w:spacing w:after="0" w:before="0"/>
+            </w:pPr>
+            <w:r>
+              <w:rPr>
+                <w:b w:val="false"/>
+                <w:bCs w:val="false"/>
+                <w:i w:val="false"/>
+                <w:iCs w:val="false"/>
+              </w:rPr>
+              <w:t xml:space="preserve">Complies. A ZKTeco intrusion detection system with motion sensors, door sensors, alarms and panic alarms is installed across the facility, and its alarm events feed the security information and event management system for correlation with system events.</w:t>
             </w:r>
           </w:p>
         </w:tc>
@@ -32744,7 +33653,79 @@
                 <w:i w:val="false"/>
                 <w:iCs w:val="false"/>
               </w:rPr>
-              <w:t xml:space="preserve"/>
+              <w:t xml:space="preserve">System Architecture Sections </w:t>
+            </w:r>
+            <w:fldSimple w:instr="HYPERLINK &quot;Document-5-Technical-Proposal-System-Architecture.docx&quot; \l &quot;sec_9_5&quot;">
+              <w:r>
+                <w:rPr>
+                  <w:rStyle w:val="Hyperlink"/>
+                  <w:b w:val="false"/>
+                  <w:bCs w:val="false"/>
+                  <w:i w:val="false"/>
+                  <w:iCs w:val="false"/>
+                </w:rPr>
+                <w:t xml:space="preserve">9.5</w:t>
+              </w:r>
+            </w:fldSimple>
+            <w:r>
+              <w:rPr>
+                <w:b w:val="false"/>
+                <w:bCs w:val="false"/>
+                <w:i w:val="false"/>
+                <w:iCs w:val="false"/>
+              </w:rPr>
+              <w:t xml:space="preserve"> and </w:t>
+            </w:r>
+            <w:fldSimple w:instr="HYPERLINK &quot;Document-5-Technical-Proposal-System-Architecture.docx&quot; \l &quot;sec_10_7&quot;">
+              <w:r>
+                <w:rPr>
+                  <w:rStyle w:val="Hyperlink"/>
+                  <w:b w:val="false"/>
+                  <w:bCs w:val="false"/>
+                  <w:i w:val="false"/>
+                  <w:iCs w:val="false"/>
+                </w:rPr>
+                <w:t xml:space="preserve">10.7</w:t>
+              </w:r>
+            </w:fldSimple>
+            <w:r>
+              <w:rPr>
+                <w:b w:val="false"/>
+                <w:bCs w:val="false"/>
+                <w:i w:val="false"/>
+                <w:iCs w:val="false"/>
+              </w:rPr>
+              <w:t xml:space="preserve">; </w:t>
+            </w:r>
+            <w:r>
+              <w:rPr>
+                <w:b w:val="false"/>
+                <w:bCs w:val="false"/>
+                <w:i w:val="false"/>
+                <w:iCs w:val="false"/>
+              </w:rPr>
+              <w:t xml:space="preserve">Cybersecurity Risk Management Plan Section </w:t>
+            </w:r>
+            <w:fldSimple w:instr="HYPERLINK &quot;Cybersecurity-Risk-Management-Plan.docx&quot; \l &quot;sec_10&quot;">
+              <w:r>
+                <w:rPr>
+                  <w:rStyle w:val="Hyperlink"/>
+                  <w:b w:val="false"/>
+                  <w:bCs w:val="false"/>
+                  <w:i w:val="false"/>
+                  <w:iCs w:val="false"/>
+                </w:rPr>
+                <w:t xml:space="preserve">10</w:t>
+              </w:r>
+            </w:fldSimple>
+            <w:r>
+              <w:rPr>
+                <w:b w:val="false"/>
+                <w:bCs w:val="false"/>
+                <w:i w:val="false"/>
+                <w:iCs w:val="false"/>
+              </w:rPr>
+              <w:t xml:space="preserve">; Attachment: Facility works bill of quantities</w:t>
             </w:r>
           </w:p>
         </w:tc>
@@ -32752,7 +33733,7 @@
       <w:tr>
         <w:tc>
           <w:tcPr>
-            <w:tcW w:type="dxa" w:w="4251"/>
+            <w:tcW w:type="dxa" w:w="2110"/>
             <w:tcMar>
               <w:top w:type="dxa" w:w="60"/>
               <w:left w:type="dxa" w:w="100"/>
@@ -32786,7 +33767,7 @@
         </w:tc>
         <w:tc>
           <w:tcPr>
-            <w:tcW w:type="dxa" w:w="2769"/>
+            <w:tcW w:type="dxa" w:w="4910"/>
             <w:tcMar>
               <w:top w:type="dxa" w:w="60"/>
               <w:left w:type="dxa" w:w="100"/>
@@ -32901,7 +33882,7 @@
       <w:tr>
         <w:tc>
           <w:tcPr>
-            <w:tcW w:type="dxa" w:w="4251"/>
+            <w:tcW w:type="dxa" w:w="2110"/>
             <w:tcMar>
               <w:top w:type="dxa" w:w="60"/>
               <w:left w:type="dxa" w:w="100"/>
@@ -32935,26 +33916,26 @@
         </w:tc>
         <w:tc>
           <w:tcPr>
-            <w:tcW w:type="dxa" w:w="2769"/>
-            <w:tcMar>
-              <w:top w:type="dxa" w:w="60"/>
-              <w:left w:type="dxa" w:w="100"/>
-              <w:bottom w:type="dxa" w:w="60"/>
-              <w:right w:type="dxa" w:w="100"/>
-            </w:tcMar>
-          </w:tcPr>
-          <w:p>
-            <w:pPr>
-              <w:spacing w:after="0" w:before="0"/>
-            </w:pPr>
-            <w:r>
-              <w:rPr>
-                <w:b w:val="false"/>
-                <w:bCs w:val="false"/>
-                <w:i w:val="false"/>
-                <w:iCs w:val="false"/>
-              </w:rPr>
-              <w:t xml:space="preserve"/>
+            <w:tcW w:type="dxa" w:w="4910"/>
+            <w:tcMar>
+              <w:top w:type="dxa" w:w="60"/>
+              <w:left w:type="dxa" w:w="100"/>
+              <w:bottom w:type="dxa" w:w="60"/>
+              <w:right w:type="dxa" w:w="100"/>
+            </w:tcMar>
+          </w:tcPr>
+          <w:p>
+            <w:pPr>
+              <w:spacing w:after="0" w:before="0"/>
+            </w:pPr>
+            <w:r>
+              <w:rPr>
+                <w:b w:val="false"/>
+                <w:bCs w:val="false"/>
+                <w:i w:val="false"/>
+                <w:iCs w:val="false"/>
+              </w:rPr>
+              <w:t xml:space="preserve">Complies. Fire detection, with smoke and heat detectors and fire alarms, covers the whole facility. Clean agent suppression protects the server room, suppression appropriate to a production area and fire extinguishers serve elsewhere, and emergency evacuation signage is installed.</w:t>
             </w:r>
           </w:p>
         </w:tc>
@@ -32979,7 +33960,28 @@
                 <w:i w:val="false"/>
                 <w:iCs w:val="false"/>
               </w:rPr>
-              <w:t xml:space="preserve"/>
+              <w:t xml:space="preserve">System Architecture Section </w:t>
+            </w:r>
+            <w:fldSimple w:instr="HYPERLINK &quot;Document-5-Technical-Proposal-System-Architecture.docx&quot; \l &quot;sec_9_5&quot;">
+              <w:r>
+                <w:rPr>
+                  <w:rStyle w:val="Hyperlink"/>
+                  <w:b w:val="false"/>
+                  <w:bCs w:val="false"/>
+                  <w:i w:val="false"/>
+                  <w:iCs w:val="false"/>
+                </w:rPr>
+                <w:t xml:space="preserve">9.5</w:t>
+              </w:r>
+            </w:fldSimple>
+            <w:r>
+              <w:rPr>
+                <w:b w:val="false"/>
+                <w:bCs w:val="false"/>
+                <w:i w:val="false"/>
+                <w:iCs w:val="false"/>
+              </w:rPr>
+              <w:t xml:space="preserve">; Attachment: Facility works bill of quantities</w:t>
             </w:r>
           </w:p>
         </w:tc>
@@ -32987,7 +33989,7 @@
       <w:tr>
         <w:tc>
           <w:tcPr>
-            <w:tcW w:type="dxa" w:w="4251"/>
+            <w:tcW w:type="dxa" w:w="2110"/>
             <w:tcMar>
               <w:top w:type="dxa" w:w="60"/>
               <w:left w:type="dxa" w:w="100"/>
@@ -33021,26 +34023,26 @@
         </w:tc>
         <w:tc>
           <w:tcPr>
-            <w:tcW w:type="dxa" w:w="2769"/>
-            <w:tcMar>
-              <w:top w:type="dxa" w:w="60"/>
-              <w:left w:type="dxa" w:w="100"/>
-              <w:bottom w:type="dxa" w:w="60"/>
-              <w:right w:type="dxa" w:w="100"/>
-            </w:tcMar>
-          </w:tcPr>
-          <w:p>
-            <w:pPr>
-              <w:spacing w:after="0" w:before="0"/>
-            </w:pPr>
-            <w:r>
-              <w:rPr>
-                <w:b w:val="false"/>
-                <w:bCs w:val="false"/>
-                <w:i w:val="false"/>
-                <w:iCs w:val="false"/>
-              </w:rPr>
-              <w:t xml:space="preserve"/>
+            <w:tcW w:type="dxa" w:w="4910"/>
+            <w:tcMar>
+              <w:top w:type="dxa" w:w="60"/>
+              <w:left w:type="dxa" w:w="100"/>
+              <w:bottom w:type="dxa" w:w="60"/>
+              <w:right w:type="dxa" w:w="100"/>
+            </w:tcMar>
+          </w:tcPr>
+          <w:p>
+            <w:pPr>
+              <w:spacing w:after="0" w:before="0"/>
+            </w:pPr>
+            <w:r>
+              <w:rPr>
+                <w:b w:val="false"/>
+                <w:bCs w:val="false"/>
+                <w:i w:val="false"/>
+                <w:iCs w:val="false"/>
+              </w:rPr>
+              <w:t xml:space="preserve">Complies. Fire detection, alarm and suppression systems are designed, installed and tested to the fire safety standards applicable in Malawi and to recognized international standards for detection and clean agent suppression, with fire suppression records delivered with the facility documentation.</w:t>
             </w:r>
           </w:p>
         </w:tc>
@@ -33065,7 +34067,28 @@
                 <w:i w:val="false"/>
                 <w:iCs w:val="false"/>
               </w:rPr>
-              <w:t xml:space="preserve"/>
+              <w:t xml:space="preserve">Preliminary Project Plan Section </w:t>
+            </w:r>
+            <w:fldSimple w:instr="HYPERLINK &quot;Preliminary-Project-Plan-Information-System-Sub-Plans.docx&quot; \l &quot;sec_2_10&quot;">
+              <w:r>
+                <w:rPr>
+                  <w:rStyle w:val="Hyperlink"/>
+                  <w:b w:val="false"/>
+                  <w:bCs w:val="false"/>
+                  <w:i w:val="false"/>
+                  <w:iCs w:val="false"/>
+                </w:rPr>
+                <w:t xml:space="preserve">2.10</w:t>
+              </w:r>
+            </w:fldSimple>
+            <w:r>
+              <w:rPr>
+                <w:b w:val="false"/>
+                <w:bCs w:val="false"/>
+                <w:i w:val="false"/>
+                <w:iCs w:val="false"/>
+              </w:rPr>
+              <w:t xml:space="preserve">; Attachment: Facility works bill of quantities</w:t>
             </w:r>
           </w:p>
         </w:tc>
@@ -33073,7 +34096,7 @@
       <w:tr>
         <w:tc>
           <w:tcPr>
-            <w:tcW w:type="dxa" w:w="4251"/>
+            <w:tcW w:type="dxa" w:w="2110"/>
             <w:tcMar>
               <w:top w:type="dxa" w:w="60"/>
               <w:left w:type="dxa" w:w="100"/>
@@ -33107,26 +34130,26 @@
         </w:tc>
         <w:tc>
           <w:tcPr>
-            <w:tcW w:type="dxa" w:w="2769"/>
-            <w:tcMar>
-              <w:top w:type="dxa" w:w="60"/>
-              <w:left w:type="dxa" w:w="100"/>
-              <w:bottom w:type="dxa" w:w="60"/>
-              <w:right w:type="dxa" w:w="100"/>
-            </w:tcMar>
-          </w:tcPr>
-          <w:p>
-            <w:pPr>
-              <w:spacing w:after="0" w:before="0"/>
-            </w:pPr>
-            <w:r>
-              <w:rPr>
-                <w:b w:val="false"/>
-                <w:bCs w:val="false"/>
-                <w:i w:val="false"/>
-                <w:iCs w:val="false"/>
-              </w:rPr>
-              <w:t xml:space="preserve"/>
+            <w:tcW w:type="dxa" w:w="4910"/>
+            <w:tcMar>
+              <w:top w:type="dxa" w:w="60"/>
+              <w:left w:type="dxa" w:w="100"/>
+              <w:bottom w:type="dxa" w:w="60"/>
+              <w:right w:type="dxa" w:w="100"/>
+            </w:tcMar>
+          </w:tcPr>
+          <w:p>
+            <w:pPr>
+              <w:spacing w:after="0" w:before="0"/>
+            </w:pPr>
+            <w:r>
+              <w:rPr>
+                <w:b w:val="false"/>
+                <w:bCs w:val="false"/>
+                <w:i w:val="false"/>
+                <w:iCs w:val="false"/>
+              </w:rPr>
+              <w:t xml:space="preserve">Complies. The production floor is fitted out to the approved layout, with equipment positions and clearances set in the ICT Site Preparation Guide, operator workstations with ergonomic furniture, quality control and consumables handling stations, and secure waste disposal through the controlled destruction area under dual custody.</w:t>
             </w:r>
           </w:p>
         </w:tc>
@@ -33151,7 +34174,100 @@
                 <w:i w:val="false"/>
                 <w:iCs w:val="false"/>
               </w:rPr>
-              <w:t xml:space="preserve"/>
+              <w:t xml:space="preserve">Preliminary Project Plan Sections </w:t>
+            </w:r>
+            <w:fldSimple w:instr="HYPERLINK &quot;Preliminary-Project-Plan-Information-System-Sub-Plans.docx&quot; \l &quot;sec_2_4&quot;">
+              <w:r>
+                <w:rPr>
+                  <w:rStyle w:val="Hyperlink"/>
+                  <w:b w:val="false"/>
+                  <w:bCs w:val="false"/>
+                  <w:i w:val="false"/>
+                  <w:iCs w:val="false"/>
+                </w:rPr>
+                <w:t xml:space="preserve">2.4</w:t>
+              </w:r>
+            </w:fldSimple>
+            <w:r>
+              <w:rPr>
+                <w:b w:val="false"/>
+                <w:bCs w:val="false"/>
+                <w:i w:val="false"/>
+                <w:iCs w:val="false"/>
+              </w:rPr>
+              <w:t xml:space="preserve"> and </w:t>
+            </w:r>
+            <w:fldSimple w:instr="HYPERLINK &quot;Preliminary-Project-Plan-Information-System-Sub-Plans.docx&quot; \l &quot;sec_4_5&quot;">
+              <w:r>
+                <w:rPr>
+                  <w:rStyle w:val="Hyperlink"/>
+                  <w:b w:val="false"/>
+                  <w:bCs w:val="false"/>
+                  <w:i w:val="false"/>
+                  <w:iCs w:val="false"/>
+                </w:rPr>
+                <w:t xml:space="preserve">4.5</w:t>
+              </w:r>
+            </w:fldSimple>
+            <w:r>
+              <w:rPr>
+                <w:b w:val="false"/>
+                <w:bCs w:val="false"/>
+                <w:i w:val="false"/>
+                <w:iCs w:val="false"/>
+              </w:rPr>
+              <w:t xml:space="preserve">; </w:t>
+            </w:r>
+            <w:r>
+              <w:rPr>
+                <w:b w:val="false"/>
+                <w:bCs w:val="false"/>
+                <w:i w:val="false"/>
+                <w:iCs w:val="false"/>
+              </w:rPr>
+              <w:t xml:space="preserve">System Architecture Sections </w:t>
+            </w:r>
+            <w:fldSimple w:instr="HYPERLINK &quot;Document-5-Technical-Proposal-System-Architecture.docx&quot; \l &quot;sec_6_10&quot;">
+              <w:r>
+                <w:rPr>
+                  <w:rStyle w:val="Hyperlink"/>
+                  <w:b w:val="false"/>
+                  <w:bCs w:val="false"/>
+                  <w:i w:val="false"/>
+                  <w:iCs w:val="false"/>
+                </w:rPr>
+                <w:t xml:space="preserve">6.10</w:t>
+              </w:r>
+            </w:fldSimple>
+            <w:r>
+              <w:rPr>
+                <w:b w:val="false"/>
+                <w:bCs w:val="false"/>
+                <w:i w:val="false"/>
+                <w:iCs w:val="false"/>
+              </w:rPr>
+              <w:t xml:space="preserve"> and </w:t>
+            </w:r>
+            <w:fldSimple w:instr="HYPERLINK &quot;Document-5-Technical-Proposal-System-Architecture.docx&quot; \l &quot;sec_9_4&quot;">
+              <w:r>
+                <w:rPr>
+                  <w:rStyle w:val="Hyperlink"/>
+                  <w:b w:val="false"/>
+                  <w:bCs w:val="false"/>
+                  <w:i w:val="false"/>
+                  <w:iCs w:val="false"/>
+                </w:rPr>
+                <w:t xml:space="preserve">9.4</w:t>
+              </w:r>
+            </w:fldSimple>
+            <w:r>
+              <w:rPr>
+                <w:b w:val="false"/>
+                <w:bCs w:val="false"/>
+                <w:i w:val="false"/>
+                <w:iCs w:val="false"/>
+              </w:rPr>
+              <w:t xml:space="preserve">; Attachment: Facility works preliminary drawings; Attachment: Facility works bill of quantities</w:t>
             </w:r>
           </w:p>
         </w:tc>
@@ -33159,7 +34275,7 @@
       <w:tr>
         <w:tc>
           <w:tcPr>
-            <w:tcW w:type="dxa" w:w="4251"/>
+            <w:tcW w:type="dxa" w:w="2110"/>
             <w:tcMar>
               <w:top w:type="dxa" w:w="60"/>
               <w:left w:type="dxa" w:w="100"/>
@@ -33193,26 +34309,26 @@
         </w:tc>
         <w:tc>
           <w:tcPr>
-            <w:tcW w:type="dxa" w:w="2769"/>
-            <w:tcMar>
-              <w:top w:type="dxa" w:w="60"/>
-              <w:left w:type="dxa" w:w="100"/>
-              <w:bottom w:type="dxa" w:w="60"/>
-              <w:right w:type="dxa" w:w="100"/>
-            </w:tcMar>
-          </w:tcPr>
-          <w:p>
-            <w:pPr>
-              <w:spacing w:after="0" w:before="0"/>
-            </w:pPr>
-            <w:r>
-              <w:rPr>
-                <w:b w:val="false"/>
-                <w:bCs w:val="false"/>
-                <w:i w:val="false"/>
-                <w:iCs w:val="false"/>
-              </w:rPr>
-              <w:t xml:space="preserve"/>
+            <w:tcW w:type="dxa" w:w="4910"/>
+            <w:tcMar>
+              <w:top w:type="dxa" w:w="60"/>
+              <w:left w:type="dxa" w:w="100"/>
+              <w:bottom w:type="dxa" w:w="60"/>
+              <w:right w:type="dxa" w:w="100"/>
+            </w:tcMar>
+          </w:tcPr>
+          <w:p>
+            <w:pPr>
+              <w:spacing w:after="0" w:before="0"/>
+            </w:pPr>
+            <w:r>
+              <w:rPr>
+                <w:b w:val="false"/>
+                <w:bCs w:val="false"/>
+                <w:i w:val="false"/>
+                <w:iCs w:val="false"/>
+              </w:rPr>
+              <w:t xml:space="preserve">Complies. Renovation is carried out under the contractor's Environmental and Social Management Plan, the Waste Management Plan and the Occupational Health and Safety Plan submitted with the proposal, covering occupational health and safety standards, safe working practices, environmental compliance, segregation and disposal of construction, electronic and hazardous waste, and hazard management during the works.</w:t>
             </w:r>
           </w:p>
         </w:tc>
@@ -33237,15 +34353,36 @@
                 <w:i w:val="false"/>
                 <w:iCs w:val="false"/>
               </w:rPr>
-              <w:t xml:space="preserve"/>
-            </w:r>
+              <w:t xml:space="preserve">Attachment: Occupational Health and Safety Plan; Attachment: Environmental and Social Management Plan; Attachment: Waste Management Plan; </w:t>
+            </w:r>
+            <w:r>
+              <w:rPr>
+                <w:b w:val="false"/>
+                <w:bCs w:val="false"/>
+                <w:i w:val="false"/>
+                <w:iCs w:val="false"/>
+              </w:rPr>
+              <w:t xml:space="preserve">System Architecture Section </w:t>
+            </w:r>
+            <w:fldSimple w:instr="HYPERLINK &quot;Document-5-Technical-Proposal-System-Architecture.docx&quot; \l &quot;sec_10_8&quot;">
+              <w:r>
+                <w:rPr>
+                  <w:rStyle w:val="Hyperlink"/>
+                  <w:b w:val="false"/>
+                  <w:bCs w:val="false"/>
+                  <w:i w:val="false"/>
+                  <w:iCs w:val="false"/>
+                </w:rPr>
+                <w:t xml:space="preserve">10.8</w:t>
+              </w:r>
+            </w:fldSimple>
           </w:p>
         </w:tc>
       </w:tr>
       <w:tr>
         <w:tc>
           <w:tcPr>
-            <w:tcW w:type="dxa" w:w="4251"/>
+            <w:tcW w:type="dxa" w:w="2110"/>
             <w:tcMar>
               <w:top w:type="dxa" w:w="60"/>
               <w:left w:type="dxa" w:w="100"/>
@@ -33279,26 +34416,26 @@
         </w:tc>
         <w:tc>
           <w:tcPr>
-            <w:tcW w:type="dxa" w:w="2769"/>
-            <w:tcMar>
-              <w:top w:type="dxa" w:w="60"/>
-              <w:left w:type="dxa" w:w="100"/>
-              <w:bottom w:type="dxa" w:w="60"/>
-              <w:right w:type="dxa" w:w="100"/>
-            </w:tcMar>
-          </w:tcPr>
-          <w:p>
-            <w:pPr>
-              <w:spacing w:after="0" w:before="0"/>
-            </w:pPr>
-            <w:r>
-              <w:rPr>
-                <w:b w:val="false"/>
-                <w:bCs w:val="false"/>
-                <w:i w:val="false"/>
-                <w:iCs w:val="false"/>
-              </w:rPr>
-              <w:t xml:space="preserve"/>
+            <w:tcW w:type="dxa" w:w="4910"/>
+            <w:tcMar>
+              <w:top w:type="dxa" w:w="60"/>
+              <w:left w:type="dxa" w:w="100"/>
+              <w:bottom w:type="dxa" w:w="60"/>
+              <w:right w:type="dxa" w:w="100"/>
+            </w:tcMar>
+          </w:tcPr>
+          <w:p>
+            <w:pPr>
+              <w:spacing w:after="0" w:before="0"/>
+            </w:pPr>
+            <w:r>
+              <w:rPr>
+                <w:b w:val="false"/>
+                <w:bCs w:val="false"/>
+                <w:i w:val="false"/>
+                <w:iCs w:val="false"/>
+              </w:rPr>
+              <w:t xml:space="preserve">Complies. Electrical, HVAC, environmental, fire, structured cabling and physical security systems are tested and commissioned under the facility works, including load testing, and their test reports, as-built drawings and manuals are delivered at handover. The Pre-Commissioning Test Program, as amended by Addendum No. 2, then covers network and cabling, access control, production workflow simulation, performance and capacity under load, and pilot production readiness, followed by the operational acceptance tests.</w:t>
             </w:r>
           </w:p>
         </w:tc>
@@ -33323,15 +34460,48 @@
                 <w:i w:val="false"/>
                 <w:iCs w:val="false"/>
               </w:rPr>
-              <w:t xml:space="preserve"/>
-            </w:r>
+              <w:t xml:space="preserve">Preliminary Project Plan Sections </w:t>
+            </w:r>
+            <w:fldSimple w:instr="HYPERLINK &quot;Preliminary-Project-Plan-Information-System-Sub-Plans.docx&quot; \l &quot;sec_4_5&quot;">
+              <w:r>
+                <w:rPr>
+                  <w:rStyle w:val="Hyperlink"/>
+                  <w:b w:val="false"/>
+                  <w:bCs w:val="false"/>
+                  <w:i w:val="false"/>
+                  <w:iCs w:val="false"/>
+                </w:rPr>
+                <w:t xml:space="preserve">4.5</w:t>
+              </w:r>
+            </w:fldSimple>
+            <w:r>
+              <w:rPr>
+                <w:b w:val="false"/>
+                <w:bCs w:val="false"/>
+                <w:i w:val="false"/>
+                <w:iCs w:val="false"/>
+              </w:rPr>
+              <w:t xml:space="preserve"> and </w:t>
+            </w:r>
+            <w:fldSimple w:instr="HYPERLINK &quot;Preliminary-Project-Plan-Information-System-Sub-Plans.docx&quot; \l &quot;sec_4_6&quot;">
+              <w:r>
+                <w:rPr>
+                  <w:rStyle w:val="Hyperlink"/>
+                  <w:b w:val="false"/>
+                  <w:bCs w:val="false"/>
+                  <w:i w:val="false"/>
+                  <w:iCs w:val="false"/>
+                </w:rPr>
+                <w:t xml:space="preserve">4.6</w:t>
+              </w:r>
+            </w:fldSimple>
           </w:p>
         </w:tc>
       </w:tr>
       <w:tr>
         <w:tc>
           <w:tcPr>
-            <w:tcW w:type="dxa" w:w="4251"/>
+            <w:tcW w:type="dxa" w:w="2110"/>
             <w:tcMar>
               <w:top w:type="dxa" w:w="60"/>
               <w:left w:type="dxa" w:w="100"/>
@@ -33365,7 +34535,7 @@
         </w:tc>
         <w:tc>
           <w:tcPr>
-            <w:tcW w:type="dxa" w:w="2769"/>
+            <w:tcW w:type="dxa" w:w="4910"/>
             <w:tcMar>
               <w:top w:type="dxa" w:w="60"/>
               <w:left w:type="dxa" w:w="100"/>
@@ -33450,7 +34620,7 @@
       <w:tr>
         <w:tc>
           <w:tcPr>
-            <w:tcW w:type="dxa" w:w="4251"/>
+            <w:tcW w:type="dxa" w:w="2110"/>
             <w:tcMar>
               <w:top w:type="dxa" w:w="60"/>
               <w:left w:type="dxa" w:w="100"/>
@@ -33484,26 +34654,26 @@
         </w:tc>
         <w:tc>
           <w:tcPr>
-            <w:tcW w:type="dxa" w:w="2769"/>
-            <w:tcMar>
-              <w:top w:type="dxa" w:w="60"/>
-              <w:left w:type="dxa" w:w="100"/>
-              <w:bottom w:type="dxa" w:w="60"/>
-              <w:right w:type="dxa" w:w="100"/>
-            </w:tcMar>
-          </w:tcPr>
-          <w:p>
-            <w:pPr>
-              <w:spacing w:after="0" w:before="0"/>
-            </w:pPr>
-            <w:r>
-              <w:rPr>
-                <w:b w:val="false"/>
-                <w:bCs w:val="false"/>
-                <w:i w:val="false"/>
-                <w:iCs w:val="false"/>
-              </w:rPr>
-              <w:t xml:space="preserve"/>
+            <w:tcW w:type="dxa" w:w="4910"/>
+            <w:tcMar>
+              <w:top w:type="dxa" w:w="60"/>
+              <w:left w:type="dxa" w:w="100"/>
+              <w:bottom w:type="dxa" w:w="60"/>
+              <w:right w:type="dxa" w:w="100"/>
+            </w:tcMar>
+          </w:tcPr>
+          <w:p>
+            <w:pPr>
+              <w:spacing w:after="0" w:before="0"/>
+            </w:pPr>
+            <w:r>
+              <w:rPr>
+                <w:b w:val="false"/>
+                <w:bCs w:val="false"/>
+                <w:i w:val="false"/>
+                <w:iCs w:val="false"/>
+              </w:rPr>
+              <w:t xml:space="preserve">Complies. Training on facility operations and the electrical, HVAC, fire and physical security systems, their preventive maintenance and emergency procedures is delivered under the facility works, using the as-built drawings and user manuals. It complements the Information System training, which covers emergency stops and safe working at the lines and includes a facility management participant in management training.</w:t>
             </w:r>
           </w:p>
         </w:tc>
@@ -33528,15 +34698,69 @@
                 <w:i w:val="false"/>
                 <w:iCs w:val="false"/>
               </w:rPr>
-              <w:t xml:space="preserve"/>
-            </w:r>
+              <w:t xml:space="preserve">Preliminary Project Plan Sections </w:t>
+            </w:r>
+            <w:fldSimple w:instr="HYPERLINK &quot;Preliminary-Project-Plan-Information-System-Sub-Plans.docx&quot; \l &quot;sec_3_1&quot;">
+              <w:r>
+                <w:rPr>
+                  <w:rStyle w:val="Hyperlink"/>
+                  <w:b w:val="false"/>
+                  <w:bCs w:val="false"/>
+                  <w:i w:val="false"/>
+                  <w:iCs w:val="false"/>
+                </w:rPr>
+                <w:t xml:space="preserve">3.1</w:t>
+              </w:r>
+            </w:fldSimple>
+            <w:r>
+              <w:rPr>
+                <w:b w:val="false"/>
+                <w:bCs w:val="false"/>
+                <w:i w:val="false"/>
+                <w:iCs w:val="false"/>
+              </w:rPr>
+              <w:t xml:space="preserve">, </w:t>
+            </w:r>
+            <w:fldSimple w:instr="HYPERLINK &quot;Preliminary-Project-Plan-Information-System-Sub-Plans.docx&quot; \l &quot;sec_3_2&quot;">
+              <w:r>
+                <w:rPr>
+                  <w:rStyle w:val="Hyperlink"/>
+                  <w:b w:val="false"/>
+                  <w:bCs w:val="false"/>
+                  <w:i w:val="false"/>
+                  <w:iCs w:val="false"/>
+                </w:rPr>
+                <w:t xml:space="preserve">3.2</w:t>
+              </w:r>
+            </w:fldSimple>
+            <w:r>
+              <w:rPr>
+                <w:b w:val="false"/>
+                <w:bCs w:val="false"/>
+                <w:i w:val="false"/>
+                <w:iCs w:val="false"/>
+              </w:rPr>
+              <w:t xml:space="preserve"> and </w:t>
+            </w:r>
+            <w:fldSimple w:instr="HYPERLINK &quot;Preliminary-Project-Plan-Information-System-Sub-Plans.docx&quot; \l &quot;sec_3_8&quot;">
+              <w:r>
+                <w:rPr>
+                  <w:rStyle w:val="Hyperlink"/>
+                  <w:b w:val="false"/>
+                  <w:bCs w:val="false"/>
+                  <w:i w:val="false"/>
+                  <w:iCs w:val="false"/>
+                </w:rPr>
+                <w:t xml:space="preserve">3.8</w:t>
+              </w:r>
+            </w:fldSimple>
           </w:p>
         </w:tc>
       </w:tr>
       <w:tr>
         <w:tc>
           <w:tcPr>
-            <w:tcW w:type="dxa" w:w="4251"/>
+            <w:tcW w:type="dxa" w:w="2110"/>
             <w:tcMar>
               <w:top w:type="dxa" w:w="60"/>
               <w:left w:type="dxa" w:w="100"/>
@@ -33570,26 +34794,26 @@
         </w:tc>
         <w:tc>
           <w:tcPr>
-            <w:tcW w:type="dxa" w:w="2769"/>
-            <w:tcMar>
-              <w:top w:type="dxa" w:w="60"/>
-              <w:left w:type="dxa" w:w="100"/>
-              <w:bottom w:type="dxa" w:w="60"/>
-              <w:right w:type="dxa" w:w="100"/>
-            </w:tcMar>
-          </w:tcPr>
-          <w:p>
-            <w:pPr>
-              <w:spacing w:after="0" w:before="0"/>
-            </w:pPr>
-            <w:r>
-              <w:rPr>
-                <w:b w:val="false"/>
-                <w:bCs w:val="false"/>
-                <w:i w:val="false"/>
-                <w:iCs w:val="false"/>
-              </w:rPr>
-              <w:t xml:space="preserve"/>
+            <w:tcW w:type="dxa" w:w="4910"/>
+            <w:tcMar>
+              <w:top w:type="dxa" w:w="60"/>
+              <w:left w:type="dxa" w:w="100"/>
+              <w:bottom w:type="dxa" w:w="60"/>
+              <w:right w:type="dxa" w:w="100"/>
+            </w:tcMar>
+          </w:tcPr>
+          <w:p>
+            <w:pPr>
+              <w:spacing w:after="0" w:before="0"/>
+            </w:pPr>
+            <w:r>
+              <w:rPr>
+                <w:b w:val="false"/>
+                <w:bCs w:val="false"/>
+                <w:i w:val="false"/>
+                <w:iCs w:val="false"/>
+              </w:rPr>
+              <w:t xml:space="preserve">Complies. All equipment, systems and services supplied are covered by a three-year warranty from Final Acceptance, with preventive and corrective maintenance and 24/7 support throughout. Defect liability and the workmanship and equipment warranties for the power, HVAC, fire suppression and physical security installations are provided under the facility works for the same period, backed by the manufacturers' warranty letters delivered at handover.</w:t>
             </w:r>
           </w:p>
         </w:tc>
@@ -33614,8 +34838,41 @@
                 <w:i w:val="false"/>
                 <w:iCs w:val="false"/>
               </w:rPr>
-              <w:t xml:space="preserve"/>
-            </w:r>
+              <w:t xml:space="preserve">Preliminary Project Plan Sections </w:t>
+            </w:r>
+            <w:fldSimple w:instr="HYPERLINK &quot;Preliminary-Project-Plan-Information-System-Sub-Plans.docx&quot; \l &quot;sec_5_1&quot;">
+              <w:r>
+                <w:rPr>
+                  <w:rStyle w:val="Hyperlink"/>
+                  <w:b w:val="false"/>
+                  <w:bCs w:val="false"/>
+                  <w:i w:val="false"/>
+                  <w:iCs w:val="false"/>
+                </w:rPr>
+                <w:t xml:space="preserve">5.1</w:t>
+              </w:r>
+            </w:fldSimple>
+            <w:r>
+              <w:rPr>
+                <w:b w:val="false"/>
+                <w:bCs w:val="false"/>
+                <w:i w:val="false"/>
+                <w:iCs w:val="false"/>
+              </w:rPr>
+              <w:t xml:space="preserve"> and </w:t>
+            </w:r>
+            <w:fldSimple w:instr="HYPERLINK &quot;Preliminary-Project-Plan-Information-System-Sub-Plans.docx&quot; \l &quot;sec_5_4&quot;">
+              <w:r>
+                <w:rPr>
+                  <w:rStyle w:val="Hyperlink"/>
+                  <w:b w:val="false"/>
+                  <w:bCs w:val="false"/>
+                  <w:i w:val="false"/>
+                  <w:iCs w:val="false"/>
+                </w:rPr>
+                <w:t xml:space="preserve">5.4</w:t>
+              </w:r>
+            </w:fldSimple>
           </w:p>
         </w:tc>
       </w:tr>
@@ -34685,7 +35942,7 @@
                 <w:i w:val="false"/>
                 <w:iCs w:val="false"/>
               </w:rPr>
-              <w:t xml:space="preserve"/>
+              <w:t xml:space="preserve">Complies. Under the facility works, the electrical power tests verify the utility supply, UPS functionality, power distribution, load on the power circuits, automatic transfer between utility and generator, earthing and grounding, and voltage and frequency stability, and the results are issued as the Electrical Systems Test Report. The Information System relies on that result, and thereafter monitors power and UPS status with threshold alerts.</w:t>
             </w:r>
           </w:p>
         </w:tc>
@@ -34710,8 +35967,92 @@
                 <w:i w:val="false"/>
                 <w:iCs w:val="false"/>
               </w:rPr>
-              <w:t xml:space="preserve"/>
-            </w:r>
+              <w:t xml:space="preserve">Preliminary Project Plan Sections </w:t>
+            </w:r>
+            <w:fldSimple w:instr="HYPERLINK &quot;Preliminary-Project-Plan-Information-System-Sub-Plans.docx&quot; \l &quot;sec_2_10&quot;">
+              <w:r>
+                <w:rPr>
+                  <w:rStyle w:val="Hyperlink"/>
+                  <w:b w:val="false"/>
+                  <w:bCs w:val="false"/>
+                  <w:i w:val="false"/>
+                  <w:iCs w:val="false"/>
+                </w:rPr>
+                <w:t xml:space="preserve">2.10</w:t>
+              </w:r>
+            </w:fldSimple>
+            <w:r>
+              <w:rPr>
+                <w:b w:val="false"/>
+                <w:bCs w:val="false"/>
+                <w:i w:val="false"/>
+                <w:iCs w:val="false"/>
+              </w:rPr>
+              <w:t xml:space="preserve"> and </w:t>
+            </w:r>
+            <w:fldSimple w:instr="HYPERLINK &quot;Preliminary-Project-Plan-Information-System-Sub-Plans.docx&quot; \l &quot;sec_4_5&quot;">
+              <w:r>
+                <w:rPr>
+                  <w:rStyle w:val="Hyperlink"/>
+                  <w:b w:val="false"/>
+                  <w:bCs w:val="false"/>
+                  <w:i w:val="false"/>
+                  <w:iCs w:val="false"/>
+                </w:rPr>
+                <w:t xml:space="preserve">4.5</w:t>
+              </w:r>
+            </w:fldSimple>
+            <w:r>
+              <w:rPr>
+                <w:b w:val="false"/>
+                <w:bCs w:val="false"/>
+                <w:i w:val="false"/>
+                <w:iCs w:val="false"/>
+              </w:rPr>
+              <w:t xml:space="preserve">; </w:t>
+            </w:r>
+            <w:r>
+              <w:rPr>
+                <w:b w:val="false"/>
+                <w:bCs w:val="false"/>
+                <w:i w:val="false"/>
+                <w:iCs w:val="false"/>
+              </w:rPr>
+              <w:t xml:space="preserve">System Architecture Sections </w:t>
+            </w:r>
+            <w:fldSimple w:instr="HYPERLINK &quot;Document-5-Technical-Proposal-System-Architecture.docx&quot; \l &quot;sec_9_5&quot;">
+              <w:r>
+                <w:rPr>
+                  <w:rStyle w:val="Hyperlink"/>
+                  <w:b w:val="false"/>
+                  <w:bCs w:val="false"/>
+                  <w:i w:val="false"/>
+                  <w:iCs w:val="false"/>
+                </w:rPr>
+                <w:t xml:space="preserve">9.5</w:t>
+              </w:r>
+            </w:fldSimple>
+            <w:r>
+              <w:rPr>
+                <w:b w:val="false"/>
+                <w:bCs w:val="false"/>
+                <w:i w:val="false"/>
+                <w:iCs w:val="false"/>
+              </w:rPr>
+              <w:t xml:space="preserve"> and </w:t>
+            </w:r>
+            <w:fldSimple w:instr="HYPERLINK &quot;Document-5-Technical-Proposal-System-Architecture.docx&quot; \l &quot;sec_12_2&quot;">
+              <w:r>
+                <w:rPr>
+                  <w:rStyle w:val="Hyperlink"/>
+                  <w:b w:val="false"/>
+                  <w:bCs w:val="false"/>
+                  <w:i w:val="false"/>
+                  <w:iCs w:val="false"/>
+                </w:rPr>
+                <w:t xml:space="preserve">12.2</w:t>
+              </w:r>
+            </w:fldSimple>
           </w:p>
         </w:tc>
       </w:tr>
@@ -34771,7 +36112,7 @@
                 <w:i w:val="false"/>
                 <w:iCs w:val="false"/>
               </w:rPr>
-              <w:t xml:space="preserve"/>
+              <w:t xml:space="preserve">Complies. Under the facility works, the environmental tests verify HVAC temperature and humidity control and airflow, smoke detector function, alarm activation, suppression system readiness and the water leakage detection sensors, and the results are issued as the Environmental Systems Readiness Report. Temperature, humidity and power readings then feed the System's monitoring and alerting, and environmental monitoring events feed security event management.</w:t>
             </w:r>
           </w:p>
         </w:tc>
@@ -34796,8 +36137,92 @@
                 <w:i w:val="false"/>
                 <w:iCs w:val="false"/>
               </w:rPr>
-              <w:t xml:space="preserve"/>
-            </w:r>
+              <w:t xml:space="preserve">Preliminary Project Plan Section </w:t>
+            </w:r>
+            <w:fldSimple w:instr="HYPERLINK &quot;Preliminary-Project-Plan-Information-System-Sub-Plans.docx&quot; \l &quot;sec_4_5&quot;">
+              <w:r>
+                <w:rPr>
+                  <w:rStyle w:val="Hyperlink"/>
+                  <w:b w:val="false"/>
+                  <w:bCs w:val="false"/>
+                  <w:i w:val="false"/>
+                  <w:iCs w:val="false"/>
+                </w:rPr>
+                <w:t xml:space="preserve">4.5</w:t>
+              </w:r>
+            </w:fldSimple>
+            <w:r>
+              <w:rPr>
+                <w:b w:val="false"/>
+                <w:bCs w:val="false"/>
+                <w:i w:val="false"/>
+                <w:iCs w:val="false"/>
+              </w:rPr>
+              <w:t xml:space="preserve">; </w:t>
+            </w:r>
+            <w:r>
+              <w:rPr>
+                <w:b w:val="false"/>
+                <w:bCs w:val="false"/>
+                <w:i w:val="false"/>
+                <w:iCs w:val="false"/>
+              </w:rPr>
+              <w:t xml:space="preserve">System Architecture Sections </w:t>
+            </w:r>
+            <w:fldSimple w:instr="HYPERLINK &quot;Document-5-Technical-Proposal-System-Architecture.docx&quot; \l &quot;sec_9_5&quot;">
+              <w:r>
+                <w:rPr>
+                  <w:rStyle w:val="Hyperlink"/>
+                  <w:b w:val="false"/>
+                  <w:bCs w:val="false"/>
+                  <w:i w:val="false"/>
+                  <w:iCs w:val="false"/>
+                </w:rPr>
+                <w:t xml:space="preserve">9.5</w:t>
+              </w:r>
+            </w:fldSimple>
+            <w:r>
+              <w:rPr>
+                <w:b w:val="false"/>
+                <w:bCs w:val="false"/>
+                <w:i w:val="false"/>
+                <w:iCs w:val="false"/>
+              </w:rPr>
+              <w:t xml:space="preserve">, </w:t>
+            </w:r>
+            <w:fldSimple w:instr="HYPERLINK &quot;Document-5-Technical-Proposal-System-Architecture.docx&quot; \l &quot;sec_10_7&quot;">
+              <w:r>
+                <w:rPr>
+                  <w:rStyle w:val="Hyperlink"/>
+                  <w:b w:val="false"/>
+                  <w:bCs w:val="false"/>
+                  <w:i w:val="false"/>
+                  <w:iCs w:val="false"/>
+                </w:rPr>
+                <w:t xml:space="preserve">10.7</w:t>
+              </w:r>
+            </w:fldSimple>
+            <w:r>
+              <w:rPr>
+                <w:b w:val="false"/>
+                <w:bCs w:val="false"/>
+                <w:i w:val="false"/>
+                <w:iCs w:val="false"/>
+              </w:rPr>
+              <w:t xml:space="preserve"> and </w:t>
+            </w:r>
+            <w:fldSimple w:instr="HYPERLINK &quot;Document-5-Technical-Proposal-System-Architecture.docx&quot; \l &quot;sec_12_2&quot;">
+              <w:r>
+                <w:rPr>
+                  <w:rStyle w:val="Hyperlink"/>
+                  <w:b w:val="false"/>
+                  <w:bCs w:val="false"/>
+                  <w:i w:val="false"/>
+                  <w:iCs w:val="false"/>
+                </w:rPr>
+                <w:t xml:space="preserve">12.2</w:t>
+              </w:r>
+            </w:fldSimple>
           </w:p>
         </w:tc>
       </w:tr>

</xml_diff>

<commit_message>
Stop citing a factory acceptance hosting letter
No hosting letter is being requested from the manufacturer, so checklist
row 4.1.1 no longer cites one as an attachment. The row still commits the
Supplier to factory acceptance and training at the manufacturer's
facility in week 17.

Co-Authored-By: Claude Opus 5.5 <noreply@anthropic.com>
Claude-Session: https://claude.ai/code/session_01G5KtDfxnVyqdZUVCaXFbWe
</commit_message>
<xml_diff>
--- a/Technical-Responsiveness-Checklist.docx
+++ b/Technical-Responsiveness-Checklist.docx
@@ -34922,8 +34922,8 @@
       </w:tblPr>
       <w:tblGrid>
         <w:gridCol w:w="1890"/>
-        <w:gridCol w:w="5131"/>
-        <w:gridCol w:w="1999"/>
+        <w:gridCol w:w="5130"/>
+        <w:gridCol w:w="2000"/>
       </w:tblGrid>
       <w:tr>
         <w:trPr>
@@ -34957,7 +34957,7 @@
         </w:tc>
         <w:tc>
           <w:tcPr>
-            <w:tcW w:type="dxa" w:w="5131"/>
+            <w:tcW w:type="dxa" w:w="5130"/>
             <w:shd w:fill="EDEDED" w:val="clear"/>
             <w:tcMar>
               <w:top w:type="dxa" w:w="60"/>
@@ -34983,7 +34983,7 @@
         </w:tc>
         <w:tc>
           <w:tcPr>
-            <w:tcW w:type="dxa" w:w="1999"/>
+            <w:tcW w:type="dxa" w:w="2000"/>
             <w:shd w:fill="EDEDED" w:val="clear"/>
             <w:tcMar>
               <w:top w:type="dxa" w:w="60"/>
@@ -35045,7 +35045,7 @@
         </w:tc>
         <w:tc>
           <w:tcPr>
-            <w:tcW w:type="dxa" w:w="5131"/>
+            <w:tcW w:type="dxa" w:w="5130"/>
             <w:tcMar>
               <w:top w:type="dxa" w:w="60"/>
               <w:left w:type="dxa" w:w="100"/>
@@ -35070,7 +35070,7 @@
         </w:tc>
         <w:tc>
           <w:tcPr>
-            <w:tcW w:type="dxa" w:w="1999"/>
+            <w:tcW w:type="dxa" w:w="2000"/>
             <w:tcMar>
               <w:top w:type="dxa" w:w="60"/>
               <w:left w:type="dxa" w:w="100"/>
@@ -35145,15 +35145,6 @@
                 <w:t xml:space="preserve">4.3</w:t>
               </w:r>
             </w:fldSimple>
-            <w:r>
-              <w:rPr>
-                <w:b w:val="false"/>
-                <w:bCs w:val="false"/>
-                <w:i w:val="false"/>
-                <w:iCs w:val="false"/>
-              </w:rPr>
-              <w:t xml:space="preserve">; Attachment: FAT hosting confirmation</w:t>
-            </w:r>
           </w:p>
         </w:tc>
       </w:tr>
@@ -35194,7 +35185,7 @@
         </w:tc>
         <w:tc>
           <w:tcPr>
-            <w:tcW w:type="dxa" w:w="5131"/>
+            <w:tcW w:type="dxa" w:w="5130"/>
             <w:tcMar>
               <w:top w:type="dxa" w:w="60"/>
               <w:left w:type="dxa" w:w="100"/>
@@ -35219,7 +35210,7 @@
         </w:tc>
         <w:tc>
           <w:tcPr>
-            <w:tcW w:type="dxa" w:w="1999"/>
+            <w:tcW w:type="dxa" w:w="2000"/>
             <w:tcMar>
               <w:top w:type="dxa" w:w="60"/>
               <w:left w:type="dxa" w:w="100"/>

</xml_diff>